<commit_message>
Apply design decisions: one success mark, actions near content, Team centred, GTM details as cards, no dark screen; log decisions
Co-Authored-By: Claude Sonnet 5.5 <noreply@anthropic.com>
Claude-Session: https://claude.ai/code/session_01Gu65fVd3CPaEia5FwZa3b7
</commit_message>
<xml_diff>
--- a/references/design-critique-cards-copy/Design_critique_cards_copy.docx
+++ b/references/design-critique-cards-copy/Design_critique_cards_copy.docx
@@ -6808,11 +6808,12 @@
         </w:tblBorders>
       </w:tblPr>
       <w:tblGrid>
-        <w:gridCol w:w="700"/>
-        <w:gridCol w:w="1200"/>
-        <w:gridCol w:w="3300"/>
-        <w:gridCol w:w="2000"/>
-        <w:gridCol w:w="2400"/>
+        <w:gridCol w:w="600"/>
+        <w:gridCol w:w="900"/>
+        <w:gridCol w:w="2500"/>
+        <w:gridCol w:w="1500"/>
+        <w:gridCol w:w="1800"/>
+        <w:gridCol w:w="2300"/>
       </w:tblGrid>
       <w:tr>
         <w:trPr>
@@ -6820,7 +6821,7 @@
         </w:trPr>
         <w:tc>
           <w:tcPr>
-            <w:tcW w:type="dxa" w:w="700"/>
+            <w:tcW w:type="dxa" w:w="600"/>
             <w:tcBorders>
               <w:top w:val="single" w:color="CBD5E1" w:sz="4"/>
               <w:left w:val="single" w:color="CBD5E1" w:sz="4"/>
@@ -6853,7 +6854,7 @@
         </w:tc>
         <w:tc>
           <w:tcPr>
-            <w:tcW w:type="dxa" w:w="1200"/>
+            <w:tcW w:type="dxa" w:w="900"/>
             <w:tcBorders>
               <w:top w:val="single" w:color="CBD5E1" w:sz="4"/>
               <w:left w:val="single" w:color="CBD5E1" w:sz="4"/>
@@ -6886,7 +6887,7 @@
         </w:tc>
         <w:tc>
           <w:tcPr>
-            <w:tcW w:type="dxa" w:w="3300"/>
+            <w:tcW w:type="dxa" w:w="2500"/>
             <w:tcBorders>
               <w:top w:val="single" w:color="CBD5E1" w:sz="4"/>
               <w:left w:val="single" w:color="CBD5E1" w:sz="4"/>
@@ -6919,7 +6920,7 @@
         </w:tc>
         <w:tc>
           <w:tcPr>
-            <w:tcW w:type="dxa" w:w="2000"/>
+            <w:tcW w:type="dxa" w:w="1500"/>
             <w:tcBorders>
               <w:top w:val="single" w:color="CBD5E1" w:sz="4"/>
               <w:left w:val="single" w:color="CBD5E1" w:sz="4"/>
@@ -6952,7 +6953,7 @@
         </w:tc>
         <w:tc>
           <w:tcPr>
-            <w:tcW w:type="dxa" w:w="2400"/>
+            <w:tcW w:type="dxa" w:w="1800"/>
             <w:tcBorders>
               <w:top w:val="single" w:color="CBD5E1" w:sz="4"/>
               <w:left w:val="single" w:color="CBD5E1" w:sz="4"/>
@@ -6980,6 +6981,39 @@
                 <w:szCs w:val="19"/>
               </w:rPr>
               <w:t xml:space="preserve">Question for the designer</w:t>
+            </w:r>
+          </w:p>
+        </w:tc>
+        <w:tc>
+          <w:tcPr>
+            <w:tcW w:type="dxa" w:w="2300"/>
+            <w:tcBorders>
+              <w:top w:val="single" w:color="CBD5E1" w:sz="4"/>
+              <w:left w:val="single" w:color="CBD5E1" w:sz="4"/>
+              <w:bottom w:val="single" w:color="CBD5E1" w:sz="4"/>
+              <w:right w:val="single" w:color="CBD5E1" w:sz="4"/>
+            </w:tcBorders>
+            <w:shd w:fill="E0E7FF" w:color="auto" w:val="clear"/>
+            <w:tcMar>
+              <w:top w:type="dxa" w:w="60"/>
+              <w:left w:type="dxa" w:w="100"/>
+              <w:bottom w:type="dxa" w:w="60"/>
+              <w:right w:type="dxa" w:w="100"/>
+            </w:tcMar>
+          </w:tcPr>
+          <w:p>
+            <w:pPr>
+              <w:spacing w:after="40" w:line="260"/>
+            </w:pPr>
+            <w:r>
+              <w:rPr>
+                <w:rFonts w:ascii="Calibri" w:cs="Calibri" w:eastAsia="Calibri" w:hAnsi="Calibri"/>
+                <w:b/>
+                <w:bCs/>
+                <w:sz w:val="19"/>
+                <w:szCs w:val="19"/>
+              </w:rPr>
+              <w:t xml:space="preserve">Decision, 14 October 2026</w:t>
             </w:r>
           </w:p>
         </w:tc>
@@ -6990,29 +7024,29 @@
         </w:trPr>
         <w:tc>
           <w:tcPr>
-            <w:tcW w:type="dxa" w:w="700"/>
-            <w:tcBorders>
-              <w:top w:val="single" w:color="CBD5E1" w:sz="4"/>
-              <w:left w:val="single" w:color="CBD5E1" w:sz="4"/>
-              <w:bottom w:val="single" w:color="CBD5E1" w:sz="4"/>
-              <w:right w:val="single" w:color="CBD5E1" w:sz="4"/>
-            </w:tcBorders>
-            <w:tcMar>
-              <w:top w:type="dxa" w:w="60"/>
-              <w:left w:type="dxa" w:w="100"/>
-              <w:bottom w:type="dxa" w:w="60"/>
-              <w:right w:type="dxa" w:w="100"/>
-            </w:tcMar>
-          </w:tcPr>
-          <w:p>
-            <w:pPr>
-              <w:spacing w:after="40" w:line="260"/>
-            </w:pPr>
-            <w:r>
-              <w:rPr>
-                <w:rFonts w:ascii="Calibri" w:cs="Calibri" w:eastAsia="Calibri" w:hAnsi="Calibri"/>
-                <w:sz w:val="18"/>
-                <w:szCs w:val="18"/>
+            <w:tcW w:type="dxa" w:w="600"/>
+            <w:tcBorders>
+              <w:top w:val="single" w:color="CBD5E1" w:sz="4"/>
+              <w:left w:val="single" w:color="CBD5E1" w:sz="4"/>
+              <w:bottom w:val="single" w:color="CBD5E1" w:sz="4"/>
+              <w:right w:val="single" w:color="CBD5E1" w:sz="4"/>
+            </w:tcBorders>
+            <w:tcMar>
+              <w:top w:type="dxa" w:w="60"/>
+              <w:left w:type="dxa" w:w="100"/>
+              <w:bottom w:type="dxa" w:w="60"/>
+              <w:right w:type="dxa" w:w="100"/>
+            </w:tcMar>
+          </w:tcPr>
+          <w:p>
+            <w:pPr>
+              <w:spacing w:after="40" w:line="260"/>
+            </w:pPr>
+            <w:r>
+              <w:rPr>
+                <w:rFonts w:ascii="Calibri" w:cs="Calibri" w:eastAsia="Calibri" w:hAnsi="Calibri"/>
+                <w:sz w:val="17"/>
+                <w:szCs w:val="17"/>
               </w:rPr>
               <w:t xml:space="preserve">I-01</w:t>
             </w:r>
@@ -7020,29 +7054,29 @@
         </w:tc>
         <w:tc>
           <w:tcPr>
-            <w:tcW w:type="dxa" w:w="1200"/>
-            <w:tcBorders>
-              <w:top w:val="single" w:color="CBD5E1" w:sz="4"/>
-              <w:left w:val="single" w:color="CBD5E1" w:sz="4"/>
-              <w:bottom w:val="single" w:color="CBD5E1" w:sz="4"/>
-              <w:right w:val="single" w:color="CBD5E1" w:sz="4"/>
-            </w:tcBorders>
-            <w:tcMar>
-              <w:top w:type="dxa" w:w="60"/>
-              <w:left w:type="dxa" w:w="100"/>
-              <w:bottom w:type="dxa" w:w="60"/>
-              <w:right w:type="dxa" w:w="100"/>
-            </w:tcMar>
-          </w:tcPr>
-          <w:p>
-            <w:pPr>
-              <w:spacing w:after="40" w:line="260"/>
-            </w:pPr>
-            <w:r>
-              <w:rPr>
-                <w:rFonts w:ascii="Calibri" w:cs="Calibri" w:eastAsia="Calibri" w:hAnsi="Calibri"/>
-                <w:sz w:val="18"/>
-                <w:szCs w:val="18"/>
+            <w:tcW w:type="dxa" w:w="900"/>
+            <w:tcBorders>
+              <w:top w:val="single" w:color="CBD5E1" w:sz="4"/>
+              <w:left w:val="single" w:color="CBD5E1" w:sz="4"/>
+              <w:bottom w:val="single" w:color="CBD5E1" w:sz="4"/>
+              <w:right w:val="single" w:color="CBD5E1" w:sz="4"/>
+            </w:tcBorders>
+            <w:tcMar>
+              <w:top w:type="dxa" w:w="60"/>
+              <w:left w:type="dxa" w:w="100"/>
+              <w:bottom w:type="dxa" w:w="60"/>
+              <w:right w:type="dxa" w:w="100"/>
+            </w:tcMar>
+          </w:tcPr>
+          <w:p>
+            <w:pPr>
+              <w:spacing w:after="40" w:line="260"/>
+            </w:pPr>
+            <w:r>
+              <w:rPr>
+                <w:rFonts w:ascii="Calibri" w:cs="Calibri" w:eastAsia="Calibri" w:hAnsi="Calibri"/>
+                <w:sz w:val="17"/>
+                <w:szCs w:val="17"/>
               </w:rPr>
               <w:t xml:space="preserve">Agent bar</w:t>
             </w:r>
@@ -7050,29 +7084,29 @@
         </w:tc>
         <w:tc>
           <w:tcPr>
-            <w:tcW w:type="dxa" w:w="3300"/>
-            <w:tcBorders>
-              <w:top w:val="single" w:color="CBD5E1" w:sz="4"/>
-              <w:left w:val="single" w:color="CBD5E1" w:sz="4"/>
-              <w:bottom w:val="single" w:color="CBD5E1" w:sz="4"/>
-              <w:right w:val="single" w:color="CBD5E1" w:sz="4"/>
-            </w:tcBorders>
-            <w:tcMar>
-              <w:top w:type="dxa" w:w="60"/>
-              <w:left w:type="dxa" w:w="100"/>
-              <w:bottom w:type="dxa" w:w="60"/>
-              <w:right w:type="dxa" w:w="100"/>
-            </w:tcMar>
-          </w:tcPr>
-          <w:p>
-            <w:pPr>
-              <w:spacing w:after="40" w:line="260"/>
-            </w:pPr>
-            <w:r>
-              <w:rPr>
-                <w:rFonts w:ascii="Calibri" w:cs="Calibri" w:eastAsia="Calibri" w:hAnsi="Calibri"/>
-                <w:sz w:val="18"/>
-                <w:szCs w:val="18"/>
+            <w:tcW w:type="dxa" w:w="2500"/>
+            <w:tcBorders>
+              <w:top w:val="single" w:color="CBD5E1" w:sz="4"/>
+              <w:left w:val="single" w:color="CBD5E1" w:sz="4"/>
+              <w:bottom w:val="single" w:color="CBD5E1" w:sz="4"/>
+              <w:right w:val="single" w:color="CBD5E1" w:sz="4"/>
+            </w:tcBorders>
+            <w:tcMar>
+              <w:top w:type="dxa" w:w="60"/>
+              <w:left w:type="dxa" w:w="100"/>
+              <w:bottom w:type="dxa" w:w="60"/>
+              <w:right w:type="dxa" w:w="100"/>
+            </w:tcMar>
+          </w:tcPr>
+          <w:p>
+            <w:pPr>
+              <w:spacing w:after="40" w:line="260"/>
+            </w:pPr>
+            <w:r>
+              <w:rPr>
+                <w:rFonts w:ascii="Calibri" w:cs="Calibri" w:eastAsia="Calibri" w:hAnsi="Calibri"/>
+                <w:sz w:val="17"/>
+                <w:szCs w:val="17"/>
               </w:rPr>
               <w:t xml:space="preserve">The copy document defines a bar line for every step. In every captured state the bar container is display:none (width 0, height 0).</w:t>
             </w:r>
@@ -7080,29 +7114,29 @@
         </w:tc>
         <w:tc>
           <w:tcPr>
-            <w:tcW w:type="dxa" w:w="2000"/>
-            <w:tcBorders>
-              <w:top w:val="single" w:color="CBD5E1" w:sz="4"/>
-              <w:left w:val="single" w:color="CBD5E1" w:sz="4"/>
-              <w:bottom w:val="single" w:color="CBD5E1" w:sz="4"/>
-              <w:right w:val="single" w:color="CBD5E1" w:sz="4"/>
-            </w:tcBorders>
-            <w:tcMar>
-              <w:top w:type="dxa" w:w="60"/>
-              <w:left w:type="dxa" w:w="100"/>
-              <w:bottom w:type="dxa" w:w="60"/>
-              <w:right w:type="dxa" w:w="100"/>
-            </w:tcMar>
-          </w:tcPr>
-          <w:p>
-            <w:pPr>
-              <w:spacing w:after="40" w:line="260"/>
-            </w:pPr>
-            <w:r>
-              <w:rPr>
-                <w:rFonts w:ascii="Calibri" w:cs="Calibri" w:eastAsia="Calibri" w:hAnsi="Calibri"/>
-                <w:sz w:val="18"/>
-                <w:szCs w:val="18"/>
+            <w:tcW w:type="dxa" w:w="1500"/>
+            <w:tcBorders>
+              <w:top w:val="single" w:color="CBD5E1" w:sz="4"/>
+              <w:left w:val="single" w:color="CBD5E1" w:sz="4"/>
+              <w:bottom w:val="single" w:color="CBD5E1" w:sz="4"/>
+              <w:right w:val="single" w:color="CBD5E1" w:sz="4"/>
+            </w:tcBorders>
+            <w:tcMar>
+              <w:top w:type="dxa" w:w="60"/>
+              <w:left w:type="dxa" w:w="100"/>
+              <w:bottom w:type="dxa" w:w="60"/>
+              <w:right w:type="dxa" w:w="100"/>
+            </w:tcMar>
+          </w:tcPr>
+          <w:p>
+            <w:pPr>
+              <w:spacing w:after="40" w:line="260"/>
+            </w:pPr>
+            <w:r>
+              <w:rPr>
+                <w:rFonts w:ascii="Calibri" w:cs="Calibri" w:eastAsia="Calibri" w:hAnsi="Calibri"/>
+                <w:sz w:val="17"/>
+                <w:szCs w:val="17"/>
               </w:rPr>
               <w:t xml:space="preserve">Nielsen heuristic 1 (visibility of status); consistency with the requirements.</w:t>
             </w:r>
@@ -7110,31 +7144,61 @@
         </w:tc>
         <w:tc>
           <w:tcPr>
-            <w:tcW w:type="dxa" w:w="2400"/>
-            <w:tcBorders>
-              <w:top w:val="single" w:color="CBD5E1" w:sz="4"/>
-              <w:left w:val="single" w:color="CBD5E1" w:sz="4"/>
-              <w:bottom w:val="single" w:color="CBD5E1" w:sz="4"/>
-              <w:right w:val="single" w:color="CBD5E1" w:sz="4"/>
-            </w:tcBorders>
-            <w:tcMar>
-              <w:top w:type="dxa" w:w="60"/>
-              <w:left w:type="dxa" w:w="100"/>
-              <w:bottom w:type="dxa" w:w="60"/>
-              <w:right w:type="dxa" w:w="100"/>
-            </w:tcMar>
-          </w:tcPr>
-          <w:p>
-            <w:pPr>
-              <w:spacing w:after="40" w:line="260"/>
-            </w:pPr>
-            <w:r>
-              <w:rPr>
-                <w:rFonts w:ascii="Calibri" w:cs="Calibri" w:eastAsia="Calibri" w:hAnsi="Calibri"/>
-                <w:sz w:val="18"/>
-                <w:szCs w:val="18"/>
+            <w:tcW w:type="dxa" w:w="1800"/>
+            <w:tcBorders>
+              <w:top w:val="single" w:color="CBD5E1" w:sz="4"/>
+              <w:left w:val="single" w:color="CBD5E1" w:sz="4"/>
+              <w:bottom w:val="single" w:color="CBD5E1" w:sz="4"/>
+              <w:right w:val="single" w:color="CBD5E1" w:sz="4"/>
+            </w:tcBorders>
+            <w:tcMar>
+              <w:top w:type="dxa" w:w="60"/>
+              <w:left w:type="dxa" w:w="100"/>
+              <w:bottom w:type="dxa" w:w="60"/>
+              <w:right w:type="dxa" w:w="100"/>
+            </w:tcMar>
+          </w:tcPr>
+          <w:p>
+            <w:pPr>
+              <w:spacing w:after="40" w:line="260"/>
+            </w:pPr>
+            <w:r>
+              <w:rPr>
+                <w:rFonts w:ascii="Calibri" w:cs="Calibri" w:eastAsia="Calibri" w:hAnsi="Calibri"/>
+                <w:sz w:val="17"/>
+                <w:szCs w:val="17"/>
               </w:rPr>
               <w:t xml:space="preserve">Is the bar intentionally removed, or should it show on summaries and success screens?</w:t>
+            </w:r>
+          </w:p>
+        </w:tc>
+        <w:tc>
+          <w:tcPr>
+            <w:tcW w:type="dxa" w:w="2300"/>
+            <w:tcBorders>
+              <w:top w:val="single" w:color="CBD5E1" w:sz="4"/>
+              <w:left w:val="single" w:color="CBD5E1" w:sz="4"/>
+              <w:bottom w:val="single" w:color="CBD5E1" w:sz="4"/>
+              <w:right w:val="single" w:color="CBD5E1" w:sz="4"/>
+            </w:tcBorders>
+            <w:tcMar>
+              <w:top w:type="dxa" w:w="60"/>
+              <w:left w:type="dxa" w:w="100"/>
+              <w:bottom w:type="dxa" w:w="60"/>
+              <w:right w:type="dxa" w:w="100"/>
+            </w:tcMar>
+          </w:tcPr>
+          <w:p>
+            <w:pPr>
+              <w:spacing w:after="40" w:line="260"/>
+            </w:pPr>
+            <w:r>
+              <w:rPr>
+                <w:rFonts w:ascii="Calibri" w:cs="Calibri" w:eastAsia="Calibri" w:hAnsi="Calibri"/>
+                <w:sz w:val="17"/>
+                <w:szCs w:val="17"/>
+              </w:rPr>
+              <w:t xml:space="preserve">Yes, intended. The bar stays hidden.</w:t>
             </w:r>
           </w:p>
         </w:tc>
@@ -7145,29 +7209,29 @@
         </w:trPr>
         <w:tc>
           <w:tcPr>
-            <w:tcW w:type="dxa" w:w="700"/>
-            <w:tcBorders>
-              <w:top w:val="single" w:color="CBD5E1" w:sz="4"/>
-              <w:left w:val="single" w:color="CBD5E1" w:sz="4"/>
-              <w:bottom w:val="single" w:color="CBD5E1" w:sz="4"/>
-              <w:right w:val="single" w:color="CBD5E1" w:sz="4"/>
-            </w:tcBorders>
-            <w:tcMar>
-              <w:top w:type="dxa" w:w="60"/>
-              <w:left w:type="dxa" w:w="100"/>
-              <w:bottom w:type="dxa" w:w="60"/>
-              <w:right w:type="dxa" w:w="100"/>
-            </w:tcMar>
-          </w:tcPr>
-          <w:p>
-            <w:pPr>
-              <w:spacing w:after="40" w:line="260"/>
-            </w:pPr>
-            <w:r>
-              <w:rPr>
-                <w:rFonts w:ascii="Calibri" w:cs="Calibri" w:eastAsia="Calibri" w:hAnsi="Calibri"/>
-                <w:sz w:val="18"/>
-                <w:szCs w:val="18"/>
+            <w:tcW w:type="dxa" w:w="600"/>
+            <w:tcBorders>
+              <w:top w:val="single" w:color="CBD5E1" w:sz="4"/>
+              <w:left w:val="single" w:color="CBD5E1" w:sz="4"/>
+              <w:bottom w:val="single" w:color="CBD5E1" w:sz="4"/>
+              <w:right w:val="single" w:color="CBD5E1" w:sz="4"/>
+            </w:tcBorders>
+            <w:tcMar>
+              <w:top w:type="dxa" w:w="60"/>
+              <w:left w:type="dxa" w:w="100"/>
+              <w:bottom w:type="dxa" w:w="60"/>
+              <w:right w:type="dxa" w:w="100"/>
+            </w:tcMar>
+          </w:tcPr>
+          <w:p>
+            <w:pPr>
+              <w:spacing w:after="40" w:line="260"/>
+            </w:pPr>
+            <w:r>
+              <w:rPr>
+                <w:rFonts w:ascii="Calibri" w:cs="Calibri" w:eastAsia="Calibri" w:hAnsi="Calibri"/>
+                <w:sz w:val="17"/>
+                <w:szCs w:val="17"/>
               </w:rPr>
               <w:t xml:space="preserve">I-02</w:t>
             </w:r>
@@ -7175,29 +7239,29 @@
         </w:tc>
         <w:tc>
           <w:tcPr>
-            <w:tcW w:type="dxa" w:w="1200"/>
-            <w:tcBorders>
-              <w:top w:val="single" w:color="CBD5E1" w:sz="4"/>
-              <w:left w:val="single" w:color="CBD5E1" w:sz="4"/>
-              <w:bottom w:val="single" w:color="CBD5E1" w:sz="4"/>
-              <w:right w:val="single" w:color="CBD5E1" w:sz="4"/>
-            </w:tcBorders>
-            <w:tcMar>
-              <w:top w:type="dxa" w:w="60"/>
-              <w:left w:type="dxa" w:w="100"/>
-              <w:bottom w:type="dxa" w:w="60"/>
-              <w:right w:type="dxa" w:w="100"/>
-            </w:tcMar>
-          </w:tcPr>
-          <w:p>
-            <w:pPr>
-              <w:spacing w:after="40" w:line="260"/>
-            </w:pPr>
-            <w:r>
-              <w:rPr>
-                <w:rFonts w:ascii="Calibri" w:cs="Calibri" w:eastAsia="Calibri" w:hAnsi="Calibri"/>
-                <w:sz w:val="18"/>
-                <w:szCs w:val="18"/>
+            <w:tcW w:type="dxa" w:w="900"/>
+            <w:tcBorders>
+              <w:top w:val="single" w:color="CBD5E1" w:sz="4"/>
+              <w:left w:val="single" w:color="CBD5E1" w:sz="4"/>
+              <w:bottom w:val="single" w:color="CBD5E1" w:sz="4"/>
+              <w:right w:val="single" w:color="CBD5E1" w:sz="4"/>
+            </w:tcBorders>
+            <w:tcMar>
+              <w:top w:type="dxa" w:w="60"/>
+              <w:left w:type="dxa" w:w="100"/>
+              <w:bottom w:type="dxa" w:w="60"/>
+              <w:right w:type="dxa" w:w="100"/>
+            </w:tcMar>
+          </w:tcPr>
+          <w:p>
+            <w:pPr>
+              <w:spacing w:after="40" w:line="260"/>
+            </w:pPr>
+            <w:r>
+              <w:rPr>
+                <w:rFonts w:ascii="Calibri" w:cs="Calibri" w:eastAsia="Calibri" w:hAnsi="Calibri"/>
+                <w:sz w:val="17"/>
+                <w:szCs w:val="17"/>
               </w:rPr>
               <w:t xml:space="preserve">Success glyph</w:t>
             </w:r>
@@ -7205,29 +7269,29 @@
         </w:tc>
         <w:tc>
           <w:tcPr>
-            <w:tcW w:type="dxa" w:w="3300"/>
-            <w:tcBorders>
-              <w:top w:val="single" w:color="CBD5E1" w:sz="4"/>
-              <w:left w:val="single" w:color="CBD5E1" w:sz="4"/>
-              <w:bottom w:val="single" w:color="CBD5E1" w:sz="4"/>
-              <w:right w:val="single" w:color="CBD5E1" w:sz="4"/>
-            </w:tcBorders>
-            <w:tcMar>
-              <w:top w:type="dxa" w:w="60"/>
-              <w:left w:type="dxa" w:w="100"/>
-              <w:bottom w:type="dxa" w:w="60"/>
-              <w:right w:type="dxa" w:w="100"/>
-            </w:tcMar>
-          </w:tcPr>
-          <w:p>
-            <w:pPr>
-              <w:spacing w:after="40" w:line="260"/>
-            </w:pPr>
-            <w:r>
-              <w:rPr>
-                <w:rFonts w:ascii="Calibri" w:cs="Calibri" w:eastAsia="Calibri" w:hAnsi="Calibri"/>
-                <w:sz w:val="18"/>
-                <w:szCs w:val="18"/>
+            <w:tcW w:type="dxa" w:w="2500"/>
+            <w:tcBorders>
+              <w:top w:val="single" w:color="CBD5E1" w:sz="4"/>
+              <w:left w:val="single" w:color="CBD5E1" w:sz="4"/>
+              <w:bottom w:val="single" w:color="CBD5E1" w:sz="4"/>
+              <w:right w:val="single" w:color="CBD5E1" w:sz="4"/>
+            </w:tcBorders>
+            <w:tcMar>
+              <w:top w:type="dxa" w:w="60"/>
+              <w:left w:type="dxa" w:w="100"/>
+              <w:bottom w:type="dxa" w:w="60"/>
+              <w:right w:type="dxa" w:w="100"/>
+            </w:tcMar>
+          </w:tcPr>
+          <w:p>
+            <w:pPr>
+              <w:spacing w:after="40" w:line="260"/>
+            </w:pPr>
+            <w:r>
+              <w:rPr>
+                <w:rFonts w:ascii="Calibri" w:cs="Calibri" w:eastAsia="Calibri" w:hAnsi="Calibri"/>
+                <w:sz w:val="17"/>
+                <w:szCs w:val="17"/>
               </w:rPr>
               <w:t xml:space="preserve">Three treatments: a pale green outlined check (brands success), a blue filled disc with a ring stamp (team, GTM, templates success), and a larger blue disc (kick-off).</w:t>
             </w:r>
@@ -7235,29 +7299,29 @@
         </w:tc>
         <w:tc>
           <w:tcPr>
-            <w:tcW w:type="dxa" w:w="2000"/>
-            <w:tcBorders>
-              <w:top w:val="single" w:color="CBD5E1" w:sz="4"/>
-              <w:left w:val="single" w:color="CBD5E1" w:sz="4"/>
-              <w:bottom w:val="single" w:color="CBD5E1" w:sz="4"/>
-              <w:right w:val="single" w:color="CBD5E1" w:sz="4"/>
-            </w:tcBorders>
-            <w:tcMar>
-              <w:top w:type="dxa" w:w="60"/>
-              <w:left w:type="dxa" w:w="100"/>
-              <w:bottom w:type="dxa" w:w="60"/>
-              <w:right w:type="dxa" w:w="100"/>
-            </w:tcMar>
-          </w:tcPr>
-          <w:p>
-            <w:pPr>
-              <w:spacing w:after="40" w:line="260"/>
-            </w:pPr>
-            <w:r>
-              <w:rPr>
-                <w:rFonts w:ascii="Calibri" w:cs="Calibri" w:eastAsia="Calibri" w:hAnsi="Calibri"/>
-                <w:sz w:val="18"/>
-                <w:szCs w:val="18"/>
+            <w:tcW w:type="dxa" w:w="1500"/>
+            <w:tcBorders>
+              <w:top w:val="single" w:color="CBD5E1" w:sz="4"/>
+              <w:left w:val="single" w:color="CBD5E1" w:sz="4"/>
+              <w:bottom w:val="single" w:color="CBD5E1" w:sz="4"/>
+              <w:right w:val="single" w:color="CBD5E1" w:sz="4"/>
+            </w:tcBorders>
+            <w:tcMar>
+              <w:top w:type="dxa" w:w="60"/>
+              <w:left w:type="dxa" w:w="100"/>
+              <w:bottom w:type="dxa" w:w="60"/>
+              <w:right w:type="dxa" w:w="100"/>
+            </w:tcMar>
+          </w:tcPr>
+          <w:p>
+            <w:pPr>
+              <w:spacing w:after="40" w:line="260"/>
+            </w:pPr>
+            <w:r>
+              <w:rPr>
+                <w:rFonts w:ascii="Calibri" w:cs="Calibri" w:eastAsia="Calibri" w:hAnsi="Calibri"/>
+                <w:sz w:val="17"/>
+                <w:szCs w:val="17"/>
               </w:rPr>
               <w:t xml:space="preserve">Gestalt similarity; Nielsen heuristic 4.</w:t>
             </w:r>
@@ -7265,31 +7329,61 @@
         </w:tc>
         <w:tc>
           <w:tcPr>
-            <w:tcW w:type="dxa" w:w="2400"/>
-            <w:tcBorders>
-              <w:top w:val="single" w:color="CBD5E1" w:sz="4"/>
-              <w:left w:val="single" w:color="CBD5E1" w:sz="4"/>
-              <w:bottom w:val="single" w:color="CBD5E1" w:sz="4"/>
-              <w:right w:val="single" w:color="CBD5E1" w:sz="4"/>
-            </w:tcBorders>
-            <w:tcMar>
-              <w:top w:type="dxa" w:w="60"/>
-              <w:left w:type="dxa" w:w="100"/>
-              <w:bottom w:type="dxa" w:w="60"/>
-              <w:right w:type="dxa" w:w="100"/>
-            </w:tcMar>
-          </w:tcPr>
-          <w:p>
-            <w:pPr>
-              <w:spacing w:after="40" w:line="260"/>
-            </w:pPr>
-            <w:r>
-              <w:rPr>
-                <w:rFonts w:ascii="Calibri" w:cs="Calibri" w:eastAsia="Calibri" w:hAnsi="Calibri"/>
-                <w:sz w:val="18"/>
-                <w:szCs w:val="18"/>
+            <w:tcW w:type="dxa" w:w="1800"/>
+            <w:tcBorders>
+              <w:top w:val="single" w:color="CBD5E1" w:sz="4"/>
+              <w:left w:val="single" w:color="CBD5E1" w:sz="4"/>
+              <w:bottom w:val="single" w:color="CBD5E1" w:sz="4"/>
+              <w:right w:val="single" w:color="CBD5E1" w:sz="4"/>
+            </w:tcBorders>
+            <w:tcMar>
+              <w:top w:type="dxa" w:w="60"/>
+              <w:left w:type="dxa" w:w="100"/>
+              <w:bottom w:type="dxa" w:w="60"/>
+              <w:right w:type="dxa" w:w="100"/>
+            </w:tcMar>
+          </w:tcPr>
+          <w:p>
+            <w:pPr>
+              <w:spacing w:after="40" w:line="260"/>
+            </w:pPr>
+            <w:r>
+              <w:rPr>
+                <w:rFonts w:ascii="Calibri" w:cs="Calibri" w:eastAsia="Calibri" w:hAnsi="Calibri"/>
+                <w:sz w:val="17"/>
+                <w:szCs w:val="17"/>
               </w:rPr>
               <w:t xml:space="preserve">Should one success mark be used for all steps, with the stamp reserved for signed documents?</w:t>
+            </w:r>
+          </w:p>
+        </w:tc>
+        <w:tc>
+          <w:tcPr>
+            <w:tcW w:type="dxa" w:w="2300"/>
+            <w:tcBorders>
+              <w:top w:val="single" w:color="CBD5E1" w:sz="4"/>
+              <w:left w:val="single" w:color="CBD5E1" w:sz="4"/>
+              <w:bottom w:val="single" w:color="CBD5E1" w:sz="4"/>
+              <w:right w:val="single" w:color="CBD5E1" w:sz="4"/>
+            </w:tcBorders>
+            <w:tcMar>
+              <w:top w:type="dxa" w:w="60"/>
+              <w:left w:type="dxa" w:w="100"/>
+              <w:bottom w:type="dxa" w:w="60"/>
+              <w:right w:type="dxa" w:w="100"/>
+            </w:tcMar>
+          </w:tcPr>
+          <w:p>
+            <w:pPr>
+              <w:spacing w:after="40" w:line="260"/>
+            </w:pPr>
+            <w:r>
+              <w:rPr>
+                <w:rFonts w:ascii="Calibri" w:cs="Calibri" w:eastAsia="Calibri" w:hAnsi="Calibri"/>
+                <w:sz w:val="17"/>
+                <w:szCs w:val="17"/>
+              </w:rPr>
+              <w:t xml:space="preserve">Left to the reviewer. Blue filled disc with a white check, no ring stamp, on every success screen. Applied in the fixes file.</w:t>
             </w:r>
           </w:p>
         </w:tc>
@@ -7300,29 +7394,29 @@
         </w:trPr>
         <w:tc>
           <w:tcPr>
-            <w:tcW w:type="dxa" w:w="700"/>
-            <w:tcBorders>
-              <w:top w:val="single" w:color="CBD5E1" w:sz="4"/>
-              <w:left w:val="single" w:color="CBD5E1" w:sz="4"/>
-              <w:bottom w:val="single" w:color="CBD5E1" w:sz="4"/>
-              <w:right w:val="single" w:color="CBD5E1" w:sz="4"/>
-            </w:tcBorders>
-            <w:tcMar>
-              <w:top w:type="dxa" w:w="60"/>
-              <w:left w:type="dxa" w:w="100"/>
-              <w:bottom w:type="dxa" w:w="60"/>
-              <w:right w:type="dxa" w:w="100"/>
-            </w:tcMar>
-          </w:tcPr>
-          <w:p>
-            <w:pPr>
-              <w:spacing w:after="40" w:line="260"/>
-            </w:pPr>
-            <w:r>
-              <w:rPr>
-                <w:rFonts w:ascii="Calibri" w:cs="Calibri" w:eastAsia="Calibri" w:hAnsi="Calibri"/>
-                <w:sz w:val="18"/>
-                <w:szCs w:val="18"/>
+            <w:tcW w:type="dxa" w:w="600"/>
+            <w:tcBorders>
+              <w:top w:val="single" w:color="CBD5E1" w:sz="4"/>
+              <w:left w:val="single" w:color="CBD5E1" w:sz="4"/>
+              <w:bottom w:val="single" w:color="CBD5E1" w:sz="4"/>
+              <w:right w:val="single" w:color="CBD5E1" w:sz="4"/>
+            </w:tcBorders>
+            <w:tcMar>
+              <w:top w:type="dxa" w:w="60"/>
+              <w:left w:type="dxa" w:w="100"/>
+              <w:bottom w:type="dxa" w:w="60"/>
+              <w:right w:type="dxa" w:w="100"/>
+            </w:tcMar>
+          </w:tcPr>
+          <w:p>
+            <w:pPr>
+              <w:spacing w:after="40" w:line="260"/>
+            </w:pPr>
+            <w:r>
+              <w:rPr>
+                <w:rFonts w:ascii="Calibri" w:cs="Calibri" w:eastAsia="Calibri" w:hAnsi="Calibri"/>
+                <w:sz w:val="17"/>
+                <w:szCs w:val="17"/>
               </w:rPr>
               <w:t xml:space="preserve">I-03</w:t>
             </w:r>
@@ -7330,29 +7424,29 @@
         </w:tc>
         <w:tc>
           <w:tcPr>
-            <w:tcW w:type="dxa" w:w="1200"/>
-            <w:tcBorders>
-              <w:top w:val="single" w:color="CBD5E1" w:sz="4"/>
-              <w:left w:val="single" w:color="CBD5E1" w:sz="4"/>
-              <w:bottom w:val="single" w:color="CBD5E1" w:sz="4"/>
-              <w:right w:val="single" w:color="CBD5E1" w:sz="4"/>
-            </w:tcBorders>
-            <w:tcMar>
-              <w:top w:type="dxa" w:w="60"/>
-              <w:left w:type="dxa" w:w="100"/>
-              <w:bottom w:type="dxa" w:w="60"/>
-              <w:right w:type="dxa" w:w="100"/>
-            </w:tcMar>
-          </w:tcPr>
-          <w:p>
-            <w:pPr>
-              <w:spacing w:after="40" w:line="260"/>
-            </w:pPr>
-            <w:r>
-              <w:rPr>
-                <w:rFonts w:ascii="Calibri" w:cs="Calibri" w:eastAsia="Calibri" w:hAnsi="Calibri"/>
-                <w:sz w:val="18"/>
-                <w:szCs w:val="18"/>
+            <w:tcW w:type="dxa" w:w="900"/>
+            <w:tcBorders>
+              <w:top w:val="single" w:color="CBD5E1" w:sz="4"/>
+              <w:left w:val="single" w:color="CBD5E1" w:sz="4"/>
+              <w:bottom w:val="single" w:color="CBD5E1" w:sz="4"/>
+              <w:right w:val="single" w:color="CBD5E1" w:sz="4"/>
+            </w:tcBorders>
+            <w:tcMar>
+              <w:top w:type="dxa" w:w="60"/>
+              <w:left w:type="dxa" w:w="100"/>
+              <w:bottom w:type="dxa" w:w="60"/>
+              <w:right w:type="dxa" w:w="100"/>
+            </w:tcMar>
+          </w:tcPr>
+          <w:p>
+            <w:pPr>
+              <w:spacing w:after="40" w:line="260"/>
+            </w:pPr>
+            <w:r>
+              <w:rPr>
+                <w:rFonts w:ascii="Calibri" w:cs="Calibri" w:eastAsia="Calibri" w:hAnsi="Calibri"/>
+                <w:sz w:val="17"/>
+                <w:szCs w:val="17"/>
               </w:rPr>
               <w:t xml:space="preserve">CTA position</w:t>
             </w:r>
@@ -7360,29 +7454,29 @@
         </w:tc>
         <w:tc>
           <w:tcPr>
-            <w:tcW w:type="dxa" w:w="3300"/>
-            <w:tcBorders>
-              <w:top w:val="single" w:color="CBD5E1" w:sz="4"/>
-              <w:left w:val="single" w:color="CBD5E1" w:sz="4"/>
-              <w:bottom w:val="single" w:color="CBD5E1" w:sz="4"/>
-              <w:right w:val="single" w:color="CBD5E1" w:sz="4"/>
-            </w:tcBorders>
-            <w:tcMar>
-              <w:top w:type="dxa" w:w="60"/>
-              <w:left w:type="dxa" w:w="100"/>
-              <w:bottom w:type="dxa" w:w="60"/>
-              <w:right w:type="dxa" w:w="100"/>
-            </w:tcMar>
-          </w:tcPr>
-          <w:p>
-            <w:pPr>
-              <w:spacing w:after="40" w:line="260"/>
-            </w:pPr>
-            <w:r>
-              <w:rPr>
-                <w:rFonts w:ascii="Calibri" w:cs="Calibri" w:eastAsia="Calibri" w:hAnsi="Calibri"/>
-                <w:sz w:val="18"/>
-                <w:szCs w:val="18"/>
+            <w:tcW w:type="dxa" w:w="2500"/>
+            <w:tcBorders>
+              <w:top w:val="single" w:color="CBD5E1" w:sz="4"/>
+              <w:left w:val="single" w:color="CBD5E1" w:sz="4"/>
+              <w:bottom w:val="single" w:color="CBD5E1" w:sz="4"/>
+              <w:right w:val="single" w:color="CBD5E1" w:sz="4"/>
+            </w:tcBorders>
+            <w:tcMar>
+              <w:top w:type="dxa" w:w="60"/>
+              <w:left w:type="dxa" w:w="100"/>
+              <w:bottom w:type="dxa" w:w="60"/>
+              <w:right w:type="dxa" w:w="100"/>
+            </w:tcMar>
+          </w:tcPr>
+          <w:p>
+            <w:pPr>
+              <w:spacing w:after="40" w:line="260"/>
+            </w:pPr>
+            <w:r>
+              <w:rPr>
+                <w:rFonts w:ascii="Calibri" w:cs="Calibri" w:eastAsia="Calibri" w:hAnsi="Calibri"/>
+                <w:sz w:val="17"/>
+                <w:szCs w:val="17"/>
               </w:rPr>
               <w:t xml:space="preserve">Success pair: Add more and Continue at the bottom-right. Kick-off and status screens: centred under the content. Summaries: bottom-right bar.</w:t>
             </w:r>
@@ -7390,29 +7484,29 @@
         </w:tc>
         <w:tc>
           <w:tcPr>
-            <w:tcW w:type="dxa" w:w="2000"/>
-            <w:tcBorders>
-              <w:top w:val="single" w:color="CBD5E1" w:sz="4"/>
-              <w:left w:val="single" w:color="CBD5E1" w:sz="4"/>
-              <w:bottom w:val="single" w:color="CBD5E1" w:sz="4"/>
-              <w:right w:val="single" w:color="CBD5E1" w:sz="4"/>
-            </w:tcBorders>
-            <w:tcMar>
-              <w:top w:type="dxa" w:w="60"/>
-              <w:left w:type="dxa" w:w="100"/>
-              <w:bottom w:type="dxa" w:w="60"/>
-              <w:right w:type="dxa" w:w="100"/>
-            </w:tcMar>
-          </w:tcPr>
-          <w:p>
-            <w:pPr>
-              <w:spacing w:after="40" w:line="260"/>
-            </w:pPr>
-            <w:r>
-              <w:rPr>
-                <w:rFonts w:ascii="Calibri" w:cs="Calibri" w:eastAsia="Calibri" w:hAnsi="Calibri"/>
-                <w:sz w:val="18"/>
-                <w:szCs w:val="18"/>
+            <w:tcW w:type="dxa" w:w="1500"/>
+            <w:tcBorders>
+              <w:top w:val="single" w:color="CBD5E1" w:sz="4"/>
+              <w:left w:val="single" w:color="CBD5E1" w:sz="4"/>
+              <w:bottom w:val="single" w:color="CBD5E1" w:sz="4"/>
+              <w:right w:val="single" w:color="CBD5E1" w:sz="4"/>
+            </w:tcBorders>
+            <w:tcMar>
+              <w:top w:type="dxa" w:w="60"/>
+              <w:left w:type="dxa" w:w="100"/>
+              <w:bottom w:type="dxa" w:w="60"/>
+              <w:right w:type="dxa" w:w="100"/>
+            </w:tcMar>
+          </w:tcPr>
+          <w:p>
+            <w:pPr>
+              <w:spacing w:after="40" w:line="260"/>
+            </w:pPr>
+            <w:r>
+              <w:rPr>
+                <w:rFonts w:ascii="Calibri" w:cs="Calibri" w:eastAsia="Calibri" w:hAnsi="Calibri"/>
+                <w:sz w:val="17"/>
+                <w:szCs w:val="17"/>
               </w:rPr>
               <w:t xml:space="preserve">Fitts's law; Nielsen heuristic 4.</w:t>
             </w:r>
@@ -7420,31 +7514,61 @@
         </w:tc>
         <w:tc>
           <w:tcPr>
-            <w:tcW w:type="dxa" w:w="2400"/>
-            <w:tcBorders>
-              <w:top w:val="single" w:color="CBD5E1" w:sz="4"/>
-              <w:left w:val="single" w:color="CBD5E1" w:sz="4"/>
-              <w:bottom w:val="single" w:color="CBD5E1" w:sz="4"/>
-              <w:right w:val="single" w:color="CBD5E1" w:sz="4"/>
-            </w:tcBorders>
-            <w:tcMar>
-              <w:top w:type="dxa" w:w="60"/>
-              <w:left w:type="dxa" w:w="100"/>
-              <w:bottom w:type="dxa" w:w="60"/>
-              <w:right w:type="dxa" w:w="100"/>
-            </w:tcMar>
-          </w:tcPr>
-          <w:p>
-            <w:pPr>
-              <w:spacing w:after="40" w:line="260"/>
-            </w:pPr>
-            <w:r>
-              <w:rPr>
-                <w:rFonts w:ascii="Calibri" w:cs="Calibri" w:eastAsia="Calibri" w:hAnsi="Calibri"/>
-                <w:sz w:val="18"/>
-                <w:szCs w:val="18"/>
+            <w:tcW w:type="dxa" w:w="1800"/>
+            <w:tcBorders>
+              <w:top w:val="single" w:color="CBD5E1" w:sz="4"/>
+              <w:left w:val="single" w:color="CBD5E1" w:sz="4"/>
+              <w:bottom w:val="single" w:color="CBD5E1" w:sz="4"/>
+              <w:right w:val="single" w:color="CBD5E1" w:sz="4"/>
+            </w:tcBorders>
+            <w:tcMar>
+              <w:top w:type="dxa" w:w="60"/>
+              <w:left w:type="dxa" w:w="100"/>
+              <w:bottom w:type="dxa" w:w="60"/>
+              <w:right w:type="dxa" w:w="100"/>
+            </w:tcMar>
+          </w:tcPr>
+          <w:p>
+            <w:pPr>
+              <w:spacing w:after="40" w:line="260"/>
+            </w:pPr>
+            <w:r>
+              <w:rPr>
+                <w:rFonts w:ascii="Calibri" w:cs="Calibri" w:eastAsia="Calibri" w:hAnsi="Calibri"/>
+                <w:sz w:val="17"/>
+                <w:szCs w:val="17"/>
               </w:rPr>
               <w:t xml:space="preserve">Is there one rule for where the primary action sits on end states?</w:t>
+            </w:r>
+          </w:p>
+        </w:tc>
+        <w:tc>
+          <w:tcPr>
+            <w:tcW w:type="dxa" w:w="2300"/>
+            <w:tcBorders>
+              <w:top w:val="single" w:color="CBD5E1" w:sz="4"/>
+              <w:left w:val="single" w:color="CBD5E1" w:sz="4"/>
+              <w:bottom w:val="single" w:color="CBD5E1" w:sz="4"/>
+              <w:right w:val="single" w:color="CBD5E1" w:sz="4"/>
+            </w:tcBorders>
+            <w:tcMar>
+              <w:top w:type="dxa" w:w="60"/>
+              <w:left w:type="dxa" w:w="100"/>
+              <w:bottom w:type="dxa" w:w="60"/>
+              <w:right w:type="dxa" w:w="100"/>
+            </w:tcMar>
+          </w:tcPr>
+          <w:p>
+            <w:pPr>
+              <w:spacing w:after="40" w:line="260"/>
+            </w:pPr>
+            <w:r>
+              <w:rPr>
+                <w:rFonts w:ascii="Calibri" w:cs="Calibri" w:eastAsia="Calibri" w:hAnsi="Calibri"/>
+                <w:sz w:val="17"/>
+                <w:szCs w:val="17"/>
+              </w:rPr>
+              <w:t xml:space="preserve">Summaries and approvals: action at the bottom of the screen. Approved and end states: action next to the content, as on the business profile approved screen. Applied to success screens.</w:t>
             </w:r>
           </w:p>
         </w:tc>
@@ -7455,29 +7579,29 @@
         </w:trPr>
         <w:tc>
           <w:tcPr>
-            <w:tcW w:type="dxa" w:w="700"/>
-            <w:tcBorders>
-              <w:top w:val="single" w:color="CBD5E1" w:sz="4"/>
-              <w:left w:val="single" w:color="CBD5E1" w:sz="4"/>
-              <w:bottom w:val="single" w:color="CBD5E1" w:sz="4"/>
-              <w:right w:val="single" w:color="CBD5E1" w:sz="4"/>
-            </w:tcBorders>
-            <w:tcMar>
-              <w:top w:type="dxa" w:w="60"/>
-              <w:left w:type="dxa" w:w="100"/>
-              <w:bottom w:type="dxa" w:w="60"/>
-              <w:right w:type="dxa" w:w="100"/>
-            </w:tcMar>
-          </w:tcPr>
-          <w:p>
-            <w:pPr>
-              <w:spacing w:after="40" w:line="260"/>
-            </w:pPr>
-            <w:r>
-              <w:rPr>
-                <w:rFonts w:ascii="Calibri" w:cs="Calibri" w:eastAsia="Calibri" w:hAnsi="Calibri"/>
-                <w:sz w:val="18"/>
-                <w:szCs w:val="18"/>
+            <w:tcW w:type="dxa" w:w="600"/>
+            <w:tcBorders>
+              <w:top w:val="single" w:color="CBD5E1" w:sz="4"/>
+              <w:left w:val="single" w:color="CBD5E1" w:sz="4"/>
+              <w:bottom w:val="single" w:color="CBD5E1" w:sz="4"/>
+              <w:right w:val="single" w:color="CBD5E1" w:sz="4"/>
+            </w:tcBorders>
+            <w:tcMar>
+              <w:top w:type="dxa" w:w="60"/>
+              <w:left w:type="dxa" w:w="100"/>
+              <w:bottom w:type="dxa" w:w="60"/>
+              <w:right w:type="dxa" w:w="100"/>
+            </w:tcMar>
+          </w:tcPr>
+          <w:p>
+            <w:pPr>
+              <w:spacing w:after="40" w:line="260"/>
+            </w:pPr>
+            <w:r>
+              <w:rPr>
+                <w:rFonts w:ascii="Calibri" w:cs="Calibri" w:eastAsia="Calibri" w:hAnsi="Calibri"/>
+                <w:sz w:val="17"/>
+                <w:szCs w:val="17"/>
               </w:rPr>
               <w:t xml:space="preserve">I-04</w:t>
             </w:r>
@@ -7485,29 +7609,29 @@
         </w:tc>
         <w:tc>
           <w:tcPr>
-            <w:tcW w:type="dxa" w:w="1200"/>
-            <w:tcBorders>
-              <w:top w:val="single" w:color="CBD5E1" w:sz="4"/>
-              <w:left w:val="single" w:color="CBD5E1" w:sz="4"/>
-              <w:bottom w:val="single" w:color="CBD5E1" w:sz="4"/>
-              <w:right w:val="single" w:color="CBD5E1" w:sz="4"/>
-            </w:tcBorders>
-            <w:tcMar>
-              <w:top w:type="dxa" w:w="60"/>
-              <w:left w:type="dxa" w:w="100"/>
-              <w:bottom w:type="dxa" w:w="60"/>
-              <w:right w:type="dxa" w:w="100"/>
-            </w:tcMar>
-          </w:tcPr>
-          <w:p>
-            <w:pPr>
-              <w:spacing w:after="40" w:line="260"/>
-            </w:pPr>
-            <w:r>
-              <w:rPr>
-                <w:rFonts w:ascii="Calibri" w:cs="Calibri" w:eastAsia="Calibri" w:hAnsi="Calibri"/>
-                <w:sz w:val="18"/>
-                <w:szCs w:val="18"/>
+            <w:tcW w:type="dxa" w:w="900"/>
+            <w:tcBorders>
+              <w:top w:val="single" w:color="CBD5E1" w:sz="4"/>
+              <w:left w:val="single" w:color="CBD5E1" w:sz="4"/>
+              <w:bottom w:val="single" w:color="CBD5E1" w:sz="4"/>
+              <w:right w:val="single" w:color="CBD5E1" w:sz="4"/>
+            </w:tcBorders>
+            <w:tcMar>
+              <w:top w:type="dxa" w:w="60"/>
+              <w:left w:type="dxa" w:w="100"/>
+              <w:bottom w:type="dxa" w:w="60"/>
+              <w:right w:type="dxa" w:w="100"/>
+            </w:tcMar>
+          </w:tcPr>
+          <w:p>
+            <w:pPr>
+              <w:spacing w:after="40" w:line="260"/>
+            </w:pPr>
+            <w:r>
+              <w:rPr>
+                <w:rFonts w:ascii="Calibri" w:cs="Calibri" w:eastAsia="Calibri" w:hAnsi="Calibri"/>
+                <w:sz w:val="17"/>
+                <w:szCs w:val="17"/>
               </w:rPr>
               <w:t xml:space="preserve">Status component</w:t>
             </w:r>
@@ -7515,29 +7639,29 @@
         </w:tc>
         <w:tc>
           <w:tcPr>
-            <w:tcW w:type="dxa" w:w="3300"/>
-            <w:tcBorders>
-              <w:top w:val="single" w:color="CBD5E1" w:sz="4"/>
-              <w:left w:val="single" w:color="CBD5E1" w:sz="4"/>
-              <w:bottom w:val="single" w:color="CBD5E1" w:sz="4"/>
-              <w:right w:val="single" w:color="CBD5E1" w:sz="4"/>
-            </w:tcBorders>
-            <w:tcMar>
-              <w:top w:type="dxa" w:w="60"/>
-              <w:left w:type="dxa" w:w="100"/>
-              <w:bottom w:type="dxa" w:w="60"/>
-              <w:right w:type="dxa" w:w="100"/>
-            </w:tcMar>
-          </w:tcPr>
-          <w:p>
-            <w:pPr>
-              <w:spacing w:after="40" w:line="260"/>
-            </w:pPr>
-            <w:r>
-              <w:rPr>
-                <w:rFonts w:ascii="Calibri" w:cs="Calibri" w:eastAsia="Calibri" w:hAnsi="Calibri"/>
-                <w:sz w:val="18"/>
-                <w:szCs w:val="18"/>
+            <w:tcW w:type="dxa" w:w="2500"/>
+            <w:tcBorders>
+              <w:top w:val="single" w:color="CBD5E1" w:sz="4"/>
+              <w:left w:val="single" w:color="CBD5E1" w:sz="4"/>
+              <w:bottom w:val="single" w:color="CBD5E1" w:sz="4"/>
+              <w:right w:val="single" w:color="CBD5E1" w:sz="4"/>
+            </w:tcBorders>
+            <w:tcMar>
+              <w:top w:type="dxa" w:w="60"/>
+              <w:left w:type="dxa" w:w="100"/>
+              <w:bottom w:type="dxa" w:w="60"/>
+              <w:right w:type="dxa" w:w="100"/>
+            </w:tcMar>
+          </w:tcPr>
+          <w:p>
+            <w:pPr>
+              <w:spacing w:after="40" w:line="260"/>
+            </w:pPr>
+            <w:r>
+              <w:rPr>
+                <w:rFonts w:ascii="Calibri" w:cs="Calibri" w:eastAsia="Calibri" w:hAnsi="Calibri"/>
+                <w:sz w:val="17"/>
+                <w:szCs w:val="17"/>
               </w:rPr>
               <w:t xml:space="preserve">Status appears as coloured text next to a chip (status screens), as a pill with a dot (list rows) and as a dot with text ("Selected" on cards).</w:t>
             </w:r>
@@ -7545,29 +7669,29 @@
         </w:tc>
         <w:tc>
           <w:tcPr>
-            <w:tcW w:type="dxa" w:w="2000"/>
-            <w:tcBorders>
-              <w:top w:val="single" w:color="CBD5E1" w:sz="4"/>
-              <w:left w:val="single" w:color="CBD5E1" w:sz="4"/>
-              <w:bottom w:val="single" w:color="CBD5E1" w:sz="4"/>
-              <w:right w:val="single" w:color="CBD5E1" w:sz="4"/>
-            </w:tcBorders>
-            <w:tcMar>
-              <w:top w:type="dxa" w:w="60"/>
-              <w:left w:type="dxa" w:w="100"/>
-              <w:bottom w:type="dxa" w:w="60"/>
-              <w:right w:type="dxa" w:w="100"/>
-            </w:tcMar>
-          </w:tcPr>
-          <w:p>
-            <w:pPr>
-              <w:spacing w:after="40" w:line="260"/>
-            </w:pPr>
-            <w:r>
-              <w:rPr>
-                <w:rFonts w:ascii="Calibri" w:cs="Calibri" w:eastAsia="Calibri" w:hAnsi="Calibri"/>
-                <w:sz w:val="18"/>
-                <w:szCs w:val="18"/>
+            <w:tcW w:type="dxa" w:w="1500"/>
+            <w:tcBorders>
+              <w:top w:val="single" w:color="CBD5E1" w:sz="4"/>
+              <w:left w:val="single" w:color="CBD5E1" w:sz="4"/>
+              <w:bottom w:val="single" w:color="CBD5E1" w:sz="4"/>
+              <w:right w:val="single" w:color="CBD5E1" w:sz="4"/>
+            </w:tcBorders>
+            <w:tcMar>
+              <w:top w:type="dxa" w:w="60"/>
+              <w:left w:type="dxa" w:w="100"/>
+              <w:bottom w:type="dxa" w:w="60"/>
+              <w:right w:type="dxa" w:w="100"/>
+            </w:tcMar>
+          </w:tcPr>
+          <w:p>
+            <w:pPr>
+              <w:spacing w:after="40" w:line="260"/>
+            </w:pPr>
+            <w:r>
+              <w:rPr>
+                <w:rFonts w:ascii="Calibri" w:cs="Calibri" w:eastAsia="Calibri" w:hAnsi="Calibri"/>
+                <w:sz w:val="17"/>
+                <w:szCs w:val="17"/>
               </w:rPr>
               <w:t xml:space="preserve">Gestalt similarity; Nielsen heuristic 4.</w:t>
             </w:r>
@@ -7575,31 +7699,61 @@
         </w:tc>
         <w:tc>
           <w:tcPr>
-            <w:tcW w:type="dxa" w:w="2400"/>
-            <w:tcBorders>
-              <w:top w:val="single" w:color="CBD5E1" w:sz="4"/>
-              <w:left w:val="single" w:color="CBD5E1" w:sz="4"/>
-              <w:bottom w:val="single" w:color="CBD5E1" w:sz="4"/>
-              <w:right w:val="single" w:color="CBD5E1" w:sz="4"/>
-            </w:tcBorders>
-            <w:tcMar>
-              <w:top w:type="dxa" w:w="60"/>
-              <w:left w:type="dxa" w:w="100"/>
-              <w:bottom w:type="dxa" w:w="60"/>
-              <w:right w:type="dxa" w:w="100"/>
-            </w:tcMar>
-          </w:tcPr>
-          <w:p>
-            <w:pPr>
-              <w:spacing w:after="40" w:line="260"/>
-            </w:pPr>
-            <w:r>
-              <w:rPr>
-                <w:rFonts w:ascii="Calibri" w:cs="Calibri" w:eastAsia="Calibri" w:hAnsi="Calibri"/>
-                <w:sz w:val="18"/>
-                <w:szCs w:val="18"/>
+            <w:tcW w:type="dxa" w:w="1800"/>
+            <w:tcBorders>
+              <w:top w:val="single" w:color="CBD5E1" w:sz="4"/>
+              <w:left w:val="single" w:color="CBD5E1" w:sz="4"/>
+              <w:bottom w:val="single" w:color="CBD5E1" w:sz="4"/>
+              <w:right w:val="single" w:color="CBD5E1" w:sz="4"/>
+            </w:tcBorders>
+            <w:tcMar>
+              <w:top w:type="dxa" w:w="60"/>
+              <w:left w:type="dxa" w:w="100"/>
+              <w:bottom w:type="dxa" w:w="60"/>
+              <w:right w:type="dxa" w:w="100"/>
+            </w:tcMar>
+          </w:tcPr>
+          <w:p>
+            <w:pPr>
+              <w:spacing w:after="40" w:line="260"/>
+            </w:pPr>
+            <w:r>
+              <w:rPr>
+                <w:rFonts w:ascii="Calibri" w:cs="Calibri" w:eastAsia="Calibri" w:hAnsi="Calibri"/>
+                <w:sz w:val="17"/>
+                <w:szCs w:val="17"/>
               </w:rPr>
               <w:t xml:space="preserve">Which form is the status component, and where may the others be used?</w:t>
+            </w:r>
+          </w:p>
+        </w:tc>
+        <w:tc>
+          <w:tcPr>
+            <w:tcW w:type="dxa" w:w="2300"/>
+            <w:tcBorders>
+              <w:top w:val="single" w:color="CBD5E1" w:sz="4"/>
+              <w:left w:val="single" w:color="CBD5E1" w:sz="4"/>
+              <w:bottom w:val="single" w:color="CBD5E1" w:sz="4"/>
+              <w:right w:val="single" w:color="CBD5E1" w:sz="4"/>
+            </w:tcBorders>
+            <w:tcMar>
+              <w:top w:type="dxa" w:w="60"/>
+              <w:left w:type="dxa" w:w="100"/>
+              <w:bottom w:type="dxa" w:w="60"/>
+              <w:right w:type="dxa" w:w="100"/>
+            </w:tcMar>
+          </w:tcPr>
+          <w:p>
+            <w:pPr>
+              <w:spacing w:after="40" w:line="260"/>
+            </w:pPr>
+            <w:r>
+              <w:rPr>
+                <w:rFonts w:ascii="Calibri" w:cs="Calibri" w:eastAsia="Calibri" w:hAnsi="Calibri"/>
+                <w:sz w:val="17"/>
+                <w:szCs w:val="17"/>
+              </w:rPr>
+              <w:t xml:space="preserve">Open. Designer will choose after seeing show/I-04_status_forms.png. Interim: on status screens the coloured text goes below the chip (applied).</w:t>
             </w:r>
           </w:p>
         </w:tc>
@@ -7610,29 +7764,29 @@
         </w:trPr>
         <w:tc>
           <w:tcPr>
-            <w:tcW w:type="dxa" w:w="700"/>
-            <w:tcBorders>
-              <w:top w:val="single" w:color="CBD5E1" w:sz="4"/>
-              <w:left w:val="single" w:color="CBD5E1" w:sz="4"/>
-              <w:bottom w:val="single" w:color="CBD5E1" w:sz="4"/>
-              <w:right w:val="single" w:color="CBD5E1" w:sz="4"/>
-            </w:tcBorders>
-            <w:tcMar>
-              <w:top w:type="dxa" w:w="60"/>
-              <w:left w:type="dxa" w:w="100"/>
-              <w:bottom w:type="dxa" w:w="60"/>
-              <w:right w:type="dxa" w:w="100"/>
-            </w:tcMar>
-          </w:tcPr>
-          <w:p>
-            <w:pPr>
-              <w:spacing w:after="40" w:line="260"/>
-            </w:pPr>
-            <w:r>
-              <w:rPr>
-                <w:rFonts w:ascii="Calibri" w:cs="Calibri" w:eastAsia="Calibri" w:hAnsi="Calibri"/>
-                <w:sz w:val="18"/>
-                <w:szCs w:val="18"/>
+            <w:tcW w:type="dxa" w:w="600"/>
+            <w:tcBorders>
+              <w:top w:val="single" w:color="CBD5E1" w:sz="4"/>
+              <w:left w:val="single" w:color="CBD5E1" w:sz="4"/>
+              <w:bottom w:val="single" w:color="CBD5E1" w:sz="4"/>
+              <w:right w:val="single" w:color="CBD5E1" w:sz="4"/>
+            </w:tcBorders>
+            <w:tcMar>
+              <w:top w:type="dxa" w:w="60"/>
+              <w:left w:type="dxa" w:w="100"/>
+              <w:bottom w:type="dxa" w:w="60"/>
+              <w:right w:type="dxa" w:w="100"/>
+            </w:tcMar>
+          </w:tcPr>
+          <w:p>
+            <w:pPr>
+              <w:spacing w:after="40" w:line="260"/>
+            </w:pPr>
+            <w:r>
+              <w:rPr>
+                <w:rFonts w:ascii="Calibri" w:cs="Calibri" w:eastAsia="Calibri" w:hAnsi="Calibri"/>
+                <w:sz w:val="17"/>
+                <w:szCs w:val="17"/>
               </w:rPr>
               <w:t xml:space="preserve">I-05</w:t>
             </w:r>
@@ -7640,29 +7794,29 @@
         </w:tc>
         <w:tc>
           <w:tcPr>
-            <w:tcW w:type="dxa" w:w="1200"/>
-            <w:tcBorders>
-              <w:top w:val="single" w:color="CBD5E1" w:sz="4"/>
-              <w:left w:val="single" w:color="CBD5E1" w:sz="4"/>
-              <w:bottom w:val="single" w:color="CBD5E1" w:sz="4"/>
-              <w:right w:val="single" w:color="CBD5E1" w:sz="4"/>
-            </w:tcBorders>
-            <w:tcMar>
-              <w:top w:type="dxa" w:w="60"/>
-              <w:left w:type="dxa" w:w="100"/>
-              <w:bottom w:type="dxa" w:w="60"/>
-              <w:right w:type="dxa" w:w="100"/>
-            </w:tcMar>
-          </w:tcPr>
-          <w:p>
-            <w:pPr>
-              <w:spacing w:after="40" w:line="260"/>
-            </w:pPr>
-            <w:r>
-              <w:rPr>
-                <w:rFonts w:ascii="Calibri" w:cs="Calibri" w:eastAsia="Calibri" w:hAnsi="Calibri"/>
-                <w:sz w:val="18"/>
-                <w:szCs w:val="18"/>
+            <w:tcW w:type="dxa" w:w="900"/>
+            <w:tcBorders>
+              <w:top w:val="single" w:color="CBD5E1" w:sz="4"/>
+              <w:left w:val="single" w:color="CBD5E1" w:sz="4"/>
+              <w:bottom w:val="single" w:color="CBD5E1" w:sz="4"/>
+              <w:right w:val="single" w:color="CBD5E1" w:sz="4"/>
+            </w:tcBorders>
+            <w:tcMar>
+              <w:top w:type="dxa" w:w="60"/>
+              <w:left w:type="dxa" w:w="100"/>
+              <w:bottom w:type="dxa" w:w="60"/>
+              <w:right w:type="dxa" w:w="100"/>
+            </w:tcMar>
+          </w:tcPr>
+          <w:p>
+            <w:pPr>
+              <w:spacing w:after="40" w:line="260"/>
+            </w:pPr>
+            <w:r>
+              <w:rPr>
+                <w:rFonts w:ascii="Calibri" w:cs="Calibri" w:eastAsia="Calibri" w:hAnsi="Calibri"/>
+                <w:sz w:val="17"/>
+                <w:szCs w:val="17"/>
               </w:rPr>
               <w:t xml:space="preserve">End-state layout</w:t>
             </w:r>
@@ -7670,29 +7824,29 @@
         </w:tc>
         <w:tc>
           <w:tcPr>
-            <w:tcW w:type="dxa" w:w="3300"/>
-            <w:tcBorders>
-              <w:top w:val="single" w:color="CBD5E1" w:sz="4"/>
-              <w:left w:val="single" w:color="CBD5E1" w:sz="4"/>
-              <w:bottom w:val="single" w:color="CBD5E1" w:sz="4"/>
-              <w:right w:val="single" w:color="CBD5E1" w:sz="4"/>
-            </w:tcBorders>
-            <w:tcMar>
-              <w:top w:type="dxa" w:w="60"/>
-              <w:left w:type="dxa" w:w="100"/>
-              <w:bottom w:type="dxa" w:w="60"/>
-              <w:right w:type="dxa" w:w="100"/>
-            </w:tcMar>
-          </w:tcPr>
-          <w:p>
-            <w:pPr>
-              <w:spacing w:after="40" w:line="260"/>
-            </w:pPr>
-            <w:r>
-              <w:rPr>
-                <w:rFonts w:ascii="Calibri" w:cs="Calibri" w:eastAsia="Calibri" w:hAnsi="Calibri"/>
-                <w:sz w:val="18"/>
-                <w:szCs w:val="18"/>
+            <w:tcW w:type="dxa" w:w="2500"/>
+            <w:tcBorders>
+              <w:top w:val="single" w:color="CBD5E1" w:sz="4"/>
+              <w:left w:val="single" w:color="CBD5E1" w:sz="4"/>
+              <w:bottom w:val="single" w:color="CBD5E1" w:sz="4"/>
+              <w:right w:val="single" w:color="CBD5E1" w:sz="4"/>
+            </w:tcBorders>
+            <w:tcMar>
+              <w:top w:type="dxa" w:w="60"/>
+              <w:left w:type="dxa" w:w="100"/>
+              <w:bottom w:type="dxa" w:w="60"/>
+              <w:right w:type="dxa" w:w="100"/>
+            </w:tcMar>
+          </w:tcPr>
+          <w:p>
+            <w:pPr>
+              <w:spacing w:after="40" w:line="260"/>
+            </w:pPr>
+            <w:r>
+              <w:rPr>
+                <w:rFonts w:ascii="Calibri" w:cs="Calibri" w:eastAsia="Calibri" w:hAnsi="Calibri"/>
+                <w:sz w:val="17"/>
+                <w:szCs w:val="17"/>
               </w:rPr>
               <w:t xml:space="preserve">Profile, brands, templates and GTM status screens use a centred single column. Team empty and Team left for later use a split layout with the title on the left and a "Team" heading on the right with a lone button.</w:t>
             </w:r>
@@ -7700,29 +7854,29 @@
         </w:tc>
         <w:tc>
           <w:tcPr>
-            <w:tcW w:type="dxa" w:w="2000"/>
-            <w:tcBorders>
-              <w:top w:val="single" w:color="CBD5E1" w:sz="4"/>
-              <w:left w:val="single" w:color="CBD5E1" w:sz="4"/>
-              <w:bottom w:val="single" w:color="CBD5E1" w:sz="4"/>
-              <w:right w:val="single" w:color="CBD5E1" w:sz="4"/>
-            </w:tcBorders>
-            <w:tcMar>
-              <w:top w:type="dxa" w:w="60"/>
-              <w:left w:type="dxa" w:w="100"/>
-              <w:bottom w:type="dxa" w:w="60"/>
-              <w:right w:type="dxa" w:w="100"/>
-            </w:tcMar>
-          </w:tcPr>
-          <w:p>
-            <w:pPr>
-              <w:spacing w:after="40" w:line="260"/>
-            </w:pPr>
-            <w:r>
-              <w:rPr>
-                <w:rFonts w:ascii="Calibri" w:cs="Calibri" w:eastAsia="Calibri" w:hAnsi="Calibri"/>
-                <w:sz w:val="18"/>
-                <w:szCs w:val="18"/>
+            <w:tcW w:type="dxa" w:w="1500"/>
+            <w:tcBorders>
+              <w:top w:val="single" w:color="CBD5E1" w:sz="4"/>
+              <w:left w:val="single" w:color="CBD5E1" w:sz="4"/>
+              <w:bottom w:val="single" w:color="CBD5E1" w:sz="4"/>
+              <w:right w:val="single" w:color="CBD5E1" w:sz="4"/>
+            </w:tcBorders>
+            <w:tcMar>
+              <w:top w:type="dxa" w:w="60"/>
+              <w:left w:type="dxa" w:w="100"/>
+              <w:bottom w:type="dxa" w:w="60"/>
+              <w:right w:type="dxa" w:w="100"/>
+            </w:tcMar>
+          </w:tcPr>
+          <w:p>
+            <w:pPr>
+              <w:spacing w:after="40" w:line="260"/>
+            </w:pPr>
+            <w:r>
+              <w:rPr>
+                <w:rFonts w:ascii="Calibri" w:cs="Calibri" w:eastAsia="Calibri" w:hAnsi="Calibri"/>
+                <w:sz w:val="17"/>
+                <w:szCs w:val="17"/>
               </w:rPr>
               <w:t xml:space="preserve">Gestalt similarity; Nielsen heuristic 4.</w:t>
             </w:r>
@@ -7730,31 +7884,61 @@
         </w:tc>
         <w:tc>
           <w:tcPr>
-            <w:tcW w:type="dxa" w:w="2400"/>
-            <w:tcBorders>
-              <w:top w:val="single" w:color="CBD5E1" w:sz="4"/>
-              <w:left w:val="single" w:color="CBD5E1" w:sz="4"/>
-              <w:bottom w:val="single" w:color="CBD5E1" w:sz="4"/>
-              <w:right w:val="single" w:color="CBD5E1" w:sz="4"/>
-            </w:tcBorders>
-            <w:tcMar>
-              <w:top w:type="dxa" w:w="60"/>
-              <w:left w:type="dxa" w:w="100"/>
-              <w:bottom w:type="dxa" w:w="60"/>
-              <w:right w:type="dxa" w:w="100"/>
-            </w:tcMar>
-          </w:tcPr>
-          <w:p>
-            <w:pPr>
-              <w:spacing w:after="40" w:line="260"/>
-            </w:pPr>
-            <w:r>
-              <w:rPr>
-                <w:rFonts w:ascii="Calibri" w:cs="Calibri" w:eastAsia="Calibri" w:hAnsi="Calibri"/>
-                <w:sz w:val="18"/>
-                <w:szCs w:val="18"/>
+            <w:tcW w:type="dxa" w:w="1800"/>
+            <w:tcBorders>
+              <w:top w:val="single" w:color="CBD5E1" w:sz="4"/>
+              <w:left w:val="single" w:color="CBD5E1" w:sz="4"/>
+              <w:bottom w:val="single" w:color="CBD5E1" w:sz="4"/>
+              <w:right w:val="single" w:color="CBD5E1" w:sz="4"/>
+            </w:tcBorders>
+            <w:tcMar>
+              <w:top w:type="dxa" w:w="60"/>
+              <w:left w:type="dxa" w:w="100"/>
+              <w:bottom w:type="dxa" w:w="60"/>
+              <w:right w:type="dxa" w:w="100"/>
+            </w:tcMar>
+          </w:tcPr>
+          <w:p>
+            <w:pPr>
+              <w:spacing w:after="40" w:line="260"/>
+            </w:pPr>
+            <w:r>
+              <w:rPr>
+                <w:rFonts w:ascii="Calibri" w:cs="Calibri" w:eastAsia="Calibri" w:hAnsi="Calibri"/>
+                <w:sz w:val="17"/>
+                <w:szCs w:val="17"/>
               </w:rPr>
               <w:t xml:space="preserve">Should Team use the centred layout like the other end states?</w:t>
+            </w:r>
+          </w:p>
+        </w:tc>
+        <w:tc>
+          <w:tcPr>
+            <w:tcW w:type="dxa" w:w="2300"/>
+            <w:tcBorders>
+              <w:top w:val="single" w:color="CBD5E1" w:sz="4"/>
+              <w:left w:val="single" w:color="CBD5E1" w:sz="4"/>
+              <w:bottom w:val="single" w:color="CBD5E1" w:sz="4"/>
+              <w:right w:val="single" w:color="CBD5E1" w:sz="4"/>
+            </w:tcBorders>
+            <w:tcMar>
+              <w:top w:type="dxa" w:w="60"/>
+              <w:left w:type="dxa" w:w="100"/>
+              <w:bottom w:type="dxa" w:w="60"/>
+              <w:right w:type="dxa" w:w="100"/>
+            </w:tcMar>
+          </w:tcPr>
+          <w:p>
+            <w:pPr>
+              <w:spacing w:after="40" w:line="260"/>
+            </w:pPr>
+            <w:r>
+              <w:rPr>
+                <w:rFonts w:ascii="Calibri" w:cs="Calibri" w:eastAsia="Calibri" w:hAnsi="Calibri"/>
+                <w:sz w:val="17"/>
+                <w:szCs w:val="17"/>
+              </w:rPr>
+              <w:t xml:space="preserve">Yes, Team uses the centred end-state layout. Applied.</w:t>
             </w:r>
           </w:p>
         </w:tc>
@@ -7765,29 +7949,29 @@
         </w:trPr>
         <w:tc>
           <w:tcPr>
-            <w:tcW w:type="dxa" w:w="700"/>
-            <w:tcBorders>
-              <w:top w:val="single" w:color="CBD5E1" w:sz="4"/>
-              <w:left w:val="single" w:color="CBD5E1" w:sz="4"/>
-              <w:bottom w:val="single" w:color="CBD5E1" w:sz="4"/>
-              <w:right w:val="single" w:color="CBD5E1" w:sz="4"/>
-            </w:tcBorders>
-            <w:tcMar>
-              <w:top w:type="dxa" w:w="60"/>
-              <w:left w:type="dxa" w:w="100"/>
-              <w:bottom w:type="dxa" w:w="60"/>
-              <w:right w:type="dxa" w:w="100"/>
-            </w:tcMar>
-          </w:tcPr>
-          <w:p>
-            <w:pPr>
-              <w:spacing w:after="40" w:line="260"/>
-            </w:pPr>
-            <w:r>
-              <w:rPr>
-                <w:rFonts w:ascii="Calibri" w:cs="Calibri" w:eastAsia="Calibri" w:hAnsi="Calibri"/>
-                <w:sz w:val="18"/>
-                <w:szCs w:val="18"/>
+            <w:tcW w:type="dxa" w:w="600"/>
+            <w:tcBorders>
+              <w:top w:val="single" w:color="CBD5E1" w:sz="4"/>
+              <w:left w:val="single" w:color="CBD5E1" w:sz="4"/>
+              <w:bottom w:val="single" w:color="CBD5E1" w:sz="4"/>
+              <w:right w:val="single" w:color="CBD5E1" w:sz="4"/>
+            </w:tcBorders>
+            <w:tcMar>
+              <w:top w:type="dxa" w:w="60"/>
+              <w:left w:type="dxa" w:w="100"/>
+              <w:bottom w:type="dxa" w:w="60"/>
+              <w:right w:type="dxa" w:w="100"/>
+            </w:tcMar>
+          </w:tcPr>
+          <w:p>
+            <w:pPr>
+              <w:spacing w:after="40" w:line="260"/>
+            </w:pPr>
+            <w:r>
+              <w:rPr>
+                <w:rFonts w:ascii="Calibri" w:cs="Calibri" w:eastAsia="Calibri" w:hAnsi="Calibri"/>
+                <w:sz w:val="17"/>
+                <w:szCs w:val="17"/>
               </w:rPr>
               <w:t xml:space="preserve">I-06</w:t>
             </w:r>
@@ -7795,29 +7979,29 @@
         </w:tc>
         <w:tc>
           <w:tcPr>
-            <w:tcW w:type="dxa" w:w="1200"/>
-            <w:tcBorders>
-              <w:top w:val="single" w:color="CBD5E1" w:sz="4"/>
-              <w:left w:val="single" w:color="CBD5E1" w:sz="4"/>
-              <w:bottom w:val="single" w:color="CBD5E1" w:sz="4"/>
-              <w:right w:val="single" w:color="CBD5E1" w:sz="4"/>
-            </w:tcBorders>
-            <w:tcMar>
-              <w:top w:type="dxa" w:w="60"/>
-              <w:left w:type="dxa" w:w="100"/>
-              <w:bottom w:type="dxa" w:w="60"/>
-              <w:right w:type="dxa" w:w="100"/>
-            </w:tcMar>
-          </w:tcPr>
-          <w:p>
-            <w:pPr>
-              <w:spacing w:after="40" w:line="260"/>
-            </w:pPr>
-            <w:r>
-              <w:rPr>
-                <w:rFonts w:ascii="Calibri" w:cs="Calibri" w:eastAsia="Calibri" w:hAnsi="Calibri"/>
-                <w:sz w:val="18"/>
-                <w:szCs w:val="18"/>
+            <w:tcW w:type="dxa" w:w="900"/>
+            <w:tcBorders>
+              <w:top w:val="single" w:color="CBD5E1" w:sz="4"/>
+              <w:left w:val="single" w:color="CBD5E1" w:sz="4"/>
+              <w:bottom w:val="single" w:color="CBD5E1" w:sz="4"/>
+              <w:right w:val="single" w:color="CBD5E1" w:sz="4"/>
+            </w:tcBorders>
+            <w:tcMar>
+              <w:top w:type="dxa" w:w="60"/>
+              <w:left w:type="dxa" w:w="100"/>
+              <w:bottom w:type="dxa" w:w="60"/>
+              <w:right w:type="dxa" w:w="100"/>
+            </w:tcMar>
+          </w:tcPr>
+          <w:p>
+            <w:pPr>
+              <w:spacing w:after="40" w:line="260"/>
+            </w:pPr>
+            <w:r>
+              <w:rPr>
+                <w:rFonts w:ascii="Calibri" w:cs="Calibri" w:eastAsia="Calibri" w:hAnsi="Calibri"/>
+                <w:sz w:val="17"/>
+                <w:szCs w:val="17"/>
               </w:rPr>
               <w:t xml:space="preserve">Interstitial colour</w:t>
             </w:r>
@@ -7825,29 +8009,29 @@
         </w:tc>
         <w:tc>
           <w:tcPr>
-            <w:tcW w:type="dxa" w:w="3300"/>
-            <w:tcBorders>
-              <w:top w:val="single" w:color="CBD5E1" w:sz="4"/>
-              <w:left w:val="single" w:color="CBD5E1" w:sz="4"/>
-              <w:bottom w:val="single" w:color="CBD5E1" w:sz="4"/>
-              <w:right w:val="single" w:color="CBD5E1" w:sz="4"/>
-            </w:tcBorders>
-            <w:tcMar>
-              <w:top w:type="dxa" w:w="60"/>
-              <w:left w:type="dxa" w:w="100"/>
-              <w:bottom w:type="dxa" w:w="60"/>
-              <w:right w:type="dxa" w:w="100"/>
-            </w:tcMar>
-          </w:tcPr>
-          <w:p>
-            <w:pPr>
-              <w:spacing w:after="40" w:line="260"/>
-            </w:pPr>
-            <w:r>
-              <w:rPr>
-                <w:rFonts w:ascii="Calibri" w:cs="Calibri" w:eastAsia="Calibri" w:hAnsi="Calibri"/>
-                <w:sz w:val="18"/>
-                <w:szCs w:val="18"/>
+            <w:tcW w:type="dxa" w:w="2500"/>
+            <w:tcBorders>
+              <w:top w:val="single" w:color="CBD5E1" w:sz="4"/>
+              <w:left w:val="single" w:color="CBD5E1" w:sz="4"/>
+              <w:bottom w:val="single" w:color="CBD5E1" w:sz="4"/>
+              <w:right w:val="single" w:color="CBD5E1" w:sz="4"/>
+            </w:tcBorders>
+            <w:tcMar>
+              <w:top w:type="dxa" w:w="60"/>
+              <w:left w:type="dxa" w:w="100"/>
+              <w:bottom w:type="dxa" w:w="60"/>
+              <w:right w:type="dxa" w:w="100"/>
+            </w:tcMar>
+          </w:tcPr>
+          <w:p>
+            <w:pPr>
+              <w:spacing w:after="40" w:line="260"/>
+            </w:pPr>
+            <w:r>
+              <w:rPr>
+                <w:rFonts w:ascii="Calibri" w:cs="Calibri" w:eastAsia="Calibri" w:hAnsi="Calibri"/>
+                <w:sz w:val="17"/>
+                <w:szCs w:val="17"/>
               </w:rPr>
               <w:t xml:space="preserve">"Your organisation has finished setting up" is a full-screen dark navy page. Every other screen is light.</w:t>
             </w:r>
@@ -7855,29 +8039,29 @@
         </w:tc>
         <w:tc>
           <w:tcPr>
-            <w:tcW w:type="dxa" w:w="2000"/>
-            <w:tcBorders>
-              <w:top w:val="single" w:color="CBD5E1" w:sz="4"/>
-              <w:left w:val="single" w:color="CBD5E1" w:sz="4"/>
-              <w:bottom w:val="single" w:color="CBD5E1" w:sz="4"/>
-              <w:right w:val="single" w:color="CBD5E1" w:sz="4"/>
-            </w:tcBorders>
-            <w:tcMar>
-              <w:top w:type="dxa" w:w="60"/>
-              <w:left w:type="dxa" w:w="100"/>
-              <w:bottom w:type="dxa" w:w="60"/>
-              <w:right w:type="dxa" w:w="100"/>
-            </w:tcMar>
-          </w:tcPr>
-          <w:p>
-            <w:pPr>
-              <w:spacing w:after="40" w:line="260"/>
-            </w:pPr>
-            <w:r>
-              <w:rPr>
-                <w:rFonts w:ascii="Calibri" w:cs="Calibri" w:eastAsia="Calibri" w:hAnsi="Calibri"/>
-                <w:sz w:val="18"/>
-                <w:szCs w:val="18"/>
+            <w:tcW w:type="dxa" w:w="1500"/>
+            <w:tcBorders>
+              <w:top w:val="single" w:color="CBD5E1" w:sz="4"/>
+              <w:left w:val="single" w:color="CBD5E1" w:sz="4"/>
+              <w:bottom w:val="single" w:color="CBD5E1" w:sz="4"/>
+              <w:right w:val="single" w:color="CBD5E1" w:sz="4"/>
+            </w:tcBorders>
+            <w:tcMar>
+              <w:top w:type="dxa" w:w="60"/>
+              <w:left w:type="dxa" w:w="100"/>
+              <w:bottom w:type="dxa" w:w="60"/>
+              <w:right w:type="dxa" w:w="100"/>
+            </w:tcMar>
+          </w:tcPr>
+          <w:p>
+            <w:pPr>
+              <w:spacing w:after="40" w:line="260"/>
+            </w:pPr>
+            <w:r>
+              <w:rPr>
+                <w:rFonts w:ascii="Calibri" w:cs="Calibri" w:eastAsia="Calibri" w:hAnsi="Calibri"/>
+                <w:sz w:val="17"/>
+                <w:szCs w:val="17"/>
               </w:rPr>
               <w:t xml:space="preserve">Gestalt similarity; peak-end rule.</w:t>
             </w:r>
@@ -7885,31 +8069,61 @@
         </w:tc>
         <w:tc>
           <w:tcPr>
-            <w:tcW w:type="dxa" w:w="2400"/>
-            <w:tcBorders>
-              <w:top w:val="single" w:color="CBD5E1" w:sz="4"/>
-              <w:left w:val="single" w:color="CBD5E1" w:sz="4"/>
-              <w:bottom w:val="single" w:color="CBD5E1" w:sz="4"/>
-              <w:right w:val="single" w:color="CBD5E1" w:sz="4"/>
-            </w:tcBorders>
-            <w:tcMar>
-              <w:top w:type="dxa" w:w="60"/>
-              <w:left w:type="dxa" w:w="100"/>
-              <w:bottom w:type="dxa" w:w="60"/>
-              <w:right w:type="dxa" w:w="100"/>
-            </w:tcMar>
-          </w:tcPr>
-          <w:p>
-            <w:pPr>
-              <w:spacing w:after="40" w:line="260"/>
-            </w:pPr>
-            <w:r>
-              <w:rPr>
-                <w:rFonts w:ascii="Calibri" w:cs="Calibri" w:eastAsia="Calibri" w:hAnsi="Calibri"/>
-                <w:sz w:val="18"/>
-                <w:szCs w:val="18"/>
+            <w:tcW w:type="dxa" w:w="1800"/>
+            <w:tcBorders>
+              <w:top w:val="single" w:color="CBD5E1" w:sz="4"/>
+              <w:left w:val="single" w:color="CBD5E1" w:sz="4"/>
+              <w:bottom w:val="single" w:color="CBD5E1" w:sz="4"/>
+              <w:right w:val="single" w:color="CBD5E1" w:sz="4"/>
+            </w:tcBorders>
+            <w:tcMar>
+              <w:top w:type="dxa" w:w="60"/>
+              <w:left w:type="dxa" w:w="100"/>
+              <w:bottom w:type="dxa" w:w="60"/>
+              <w:right w:type="dxa" w:w="100"/>
+            </w:tcMar>
+          </w:tcPr>
+          <w:p>
+            <w:pPr>
+              <w:spacing w:after="40" w:line="260"/>
+            </w:pPr>
+            <w:r>
+              <w:rPr>
+                <w:rFonts w:ascii="Calibri" w:cs="Calibri" w:eastAsia="Calibri" w:hAnsi="Calibri"/>
+                <w:sz w:val="17"/>
+                <w:szCs w:val="17"/>
               </w:rPr>
               <w:t xml:space="preserve">Is the dark screen a deliberate exception?</w:t>
+            </w:r>
+          </w:p>
+        </w:tc>
+        <w:tc>
+          <w:tcPr>
+            <w:tcW w:type="dxa" w:w="2300"/>
+            <w:tcBorders>
+              <w:top w:val="single" w:color="CBD5E1" w:sz="4"/>
+              <w:left w:val="single" w:color="CBD5E1" w:sz="4"/>
+              <w:bottom w:val="single" w:color="CBD5E1" w:sz="4"/>
+              <w:right w:val="single" w:color="CBD5E1" w:sz="4"/>
+            </w:tcBorders>
+            <w:tcMar>
+              <w:top w:type="dxa" w:w="60"/>
+              <w:left w:type="dxa" w:w="100"/>
+              <w:bottom w:type="dxa" w:w="60"/>
+              <w:right w:type="dxa" w:w="100"/>
+            </w:tcMar>
+          </w:tcPr>
+          <w:p>
+            <w:pPr>
+              <w:spacing w:after="40" w:line="260"/>
+            </w:pPr>
+            <w:r>
+              <w:rPr>
+                <w:rFonts w:ascii="Calibri" w:cs="Calibri" w:eastAsia="Calibri" w:hAnsi="Calibri"/>
+                <w:sz w:val="17"/>
+                <w:szCs w:val="17"/>
+              </w:rPr>
+              <w:t xml:space="preserve">The dark screen should not exist. Removed: the user lands in the product.</w:t>
             </w:r>
           </w:p>
         </w:tc>
@@ -7920,29 +8134,29 @@
         </w:trPr>
         <w:tc>
           <w:tcPr>
-            <w:tcW w:type="dxa" w:w="700"/>
-            <w:tcBorders>
-              <w:top w:val="single" w:color="CBD5E1" w:sz="4"/>
-              <w:left w:val="single" w:color="CBD5E1" w:sz="4"/>
-              <w:bottom w:val="single" w:color="CBD5E1" w:sz="4"/>
-              <w:right w:val="single" w:color="CBD5E1" w:sz="4"/>
-            </w:tcBorders>
-            <w:tcMar>
-              <w:top w:type="dxa" w:w="60"/>
-              <w:left w:type="dxa" w:w="100"/>
-              <w:bottom w:type="dxa" w:w="60"/>
-              <w:right w:type="dxa" w:w="100"/>
-            </w:tcMar>
-          </w:tcPr>
-          <w:p>
-            <w:pPr>
-              <w:spacing w:after="40" w:line="260"/>
-            </w:pPr>
-            <w:r>
-              <w:rPr>
-                <w:rFonts w:ascii="Calibri" w:cs="Calibri" w:eastAsia="Calibri" w:hAnsi="Calibri"/>
-                <w:sz w:val="18"/>
-                <w:szCs w:val="18"/>
+            <w:tcW w:type="dxa" w:w="600"/>
+            <w:tcBorders>
+              <w:top w:val="single" w:color="CBD5E1" w:sz="4"/>
+              <w:left w:val="single" w:color="CBD5E1" w:sz="4"/>
+              <w:bottom w:val="single" w:color="CBD5E1" w:sz="4"/>
+              <w:right w:val="single" w:color="CBD5E1" w:sz="4"/>
+            </w:tcBorders>
+            <w:tcMar>
+              <w:top w:type="dxa" w:w="60"/>
+              <w:left w:type="dxa" w:w="100"/>
+              <w:bottom w:type="dxa" w:w="60"/>
+              <w:right w:type="dxa" w:w="100"/>
+            </w:tcMar>
+          </w:tcPr>
+          <w:p>
+            <w:pPr>
+              <w:spacing w:after="40" w:line="260"/>
+            </w:pPr>
+            <w:r>
+              <w:rPr>
+                <w:rFonts w:ascii="Calibri" w:cs="Calibri" w:eastAsia="Calibri" w:hAnsi="Calibri"/>
+                <w:sz w:val="17"/>
+                <w:szCs w:val="17"/>
               </w:rPr>
               <w:t xml:space="preserve">I-07</w:t>
             </w:r>
@@ -7950,29 +8164,29 @@
         </w:tc>
         <w:tc>
           <w:tcPr>
-            <w:tcW w:type="dxa" w:w="1200"/>
-            <w:tcBorders>
-              <w:top w:val="single" w:color="CBD5E1" w:sz="4"/>
-              <w:left w:val="single" w:color="CBD5E1" w:sz="4"/>
-              <w:bottom w:val="single" w:color="CBD5E1" w:sz="4"/>
-              <w:right w:val="single" w:color="CBD5E1" w:sz="4"/>
-            </w:tcBorders>
-            <w:tcMar>
-              <w:top w:type="dxa" w:w="60"/>
-              <w:left w:type="dxa" w:w="100"/>
-              <w:bottom w:type="dxa" w:w="60"/>
-              <w:right w:type="dxa" w:w="100"/>
-            </w:tcMar>
-          </w:tcPr>
-          <w:p>
-            <w:pPr>
-              <w:spacing w:after="40" w:line="260"/>
-            </w:pPr>
-            <w:r>
-              <w:rPr>
-                <w:rFonts w:ascii="Calibri" w:cs="Calibri" w:eastAsia="Calibri" w:hAnsi="Calibri"/>
-                <w:sz w:val="18"/>
-                <w:szCs w:val="18"/>
+            <w:tcW w:type="dxa" w:w="900"/>
+            <w:tcBorders>
+              <w:top w:val="single" w:color="CBD5E1" w:sz="4"/>
+              <w:left w:val="single" w:color="CBD5E1" w:sz="4"/>
+              <w:bottom w:val="single" w:color="CBD5E1" w:sz="4"/>
+              <w:right w:val="single" w:color="CBD5E1" w:sz="4"/>
+            </w:tcBorders>
+            <w:tcMar>
+              <w:top w:type="dxa" w:w="60"/>
+              <w:left w:type="dxa" w:w="100"/>
+              <w:bottom w:type="dxa" w:w="60"/>
+              <w:right w:type="dxa" w:w="100"/>
+            </w:tcMar>
+          </w:tcPr>
+          <w:p>
+            <w:pPr>
+              <w:spacing w:after="40" w:line="260"/>
+            </w:pPr>
+            <w:r>
+              <w:rPr>
+                <w:rFonts w:ascii="Calibri" w:cs="Calibri" w:eastAsia="Calibri" w:hAnsi="Calibri"/>
+                <w:sz w:val="17"/>
+                <w:szCs w:val="17"/>
               </w:rPr>
               <w:t xml:space="preserve">Summary and details</w:t>
             </w:r>
@@ -7980,29 +8194,29 @@
         </w:tc>
         <w:tc>
           <w:tcPr>
-            <w:tcW w:type="dxa" w:w="3300"/>
-            <w:tcBorders>
-              <w:top w:val="single" w:color="CBD5E1" w:sz="4"/>
-              <w:left w:val="single" w:color="CBD5E1" w:sz="4"/>
-              <w:bottom w:val="single" w:color="CBD5E1" w:sz="4"/>
-              <w:right w:val="single" w:color="CBD5E1" w:sz="4"/>
-            </w:tcBorders>
-            <w:tcMar>
-              <w:top w:type="dxa" w:w="60"/>
-              <w:left w:type="dxa" w:w="100"/>
-              <w:bottom w:type="dxa" w:w="60"/>
-              <w:right w:type="dxa" w:w="100"/>
-            </w:tcMar>
-          </w:tcPr>
-          <w:p>
-            <w:pPr>
-              <w:spacing w:after="40" w:line="260"/>
-            </w:pPr>
-            <w:r>
-              <w:rPr>
-                <w:rFonts w:ascii="Calibri" w:cs="Calibri" w:eastAsia="Calibri" w:hAnsi="Calibri"/>
-                <w:sz w:val="18"/>
-                <w:szCs w:val="18"/>
+            <w:tcW w:type="dxa" w:w="2500"/>
+            <w:tcBorders>
+              <w:top w:val="single" w:color="CBD5E1" w:sz="4"/>
+              <w:left w:val="single" w:color="CBD5E1" w:sz="4"/>
+              <w:bottom w:val="single" w:color="CBD5E1" w:sz="4"/>
+              <w:right w:val="single" w:color="CBD5E1" w:sz="4"/>
+            </w:tcBorders>
+            <w:tcMar>
+              <w:top w:type="dxa" w:w="60"/>
+              <w:left w:type="dxa" w:w="100"/>
+              <w:bottom w:type="dxa" w:w="60"/>
+              <w:right w:type="dxa" w:w="100"/>
+            </w:tcMar>
+          </w:tcPr>
+          <w:p>
+            <w:pPr>
+              <w:spacing w:after="40" w:line="260"/>
+            </w:pPr>
+            <w:r>
+              <w:rPr>
+                <w:rFonts w:ascii="Calibri" w:cs="Calibri" w:eastAsia="Calibri" w:hAnsi="Calibri"/>
+                <w:sz w:val="17"/>
+                <w:szCs w:val="17"/>
               </w:rPr>
               <w:t xml:space="preserve">The GTM summary uses cards. The GTM details page still uses the earlier list with green tags and long chips, so the two views of one step look unrelated.</w:t>
             </w:r>
@@ -8010,29 +8224,29 @@
         </w:tc>
         <w:tc>
           <w:tcPr>
-            <w:tcW w:type="dxa" w:w="2000"/>
-            <w:tcBorders>
-              <w:top w:val="single" w:color="CBD5E1" w:sz="4"/>
-              <w:left w:val="single" w:color="CBD5E1" w:sz="4"/>
-              <w:bottom w:val="single" w:color="CBD5E1" w:sz="4"/>
-              <w:right w:val="single" w:color="CBD5E1" w:sz="4"/>
-            </w:tcBorders>
-            <w:tcMar>
-              <w:top w:type="dxa" w:w="60"/>
-              <w:left w:type="dxa" w:w="100"/>
-              <w:bottom w:type="dxa" w:w="60"/>
-              <w:right w:type="dxa" w:w="100"/>
-            </w:tcMar>
-          </w:tcPr>
-          <w:p>
-            <w:pPr>
-              <w:spacing w:after="40" w:line="260"/>
-            </w:pPr>
-            <w:r>
-              <w:rPr>
-                <w:rFonts w:ascii="Calibri" w:cs="Calibri" w:eastAsia="Calibri" w:hAnsi="Calibri"/>
-                <w:sz w:val="18"/>
-                <w:szCs w:val="18"/>
+            <w:tcW w:type="dxa" w:w="1500"/>
+            <w:tcBorders>
+              <w:top w:val="single" w:color="CBD5E1" w:sz="4"/>
+              <w:left w:val="single" w:color="CBD5E1" w:sz="4"/>
+              <w:bottom w:val="single" w:color="CBD5E1" w:sz="4"/>
+              <w:right w:val="single" w:color="CBD5E1" w:sz="4"/>
+            </w:tcBorders>
+            <w:tcMar>
+              <w:top w:type="dxa" w:w="60"/>
+              <w:left w:type="dxa" w:w="100"/>
+              <w:bottom w:type="dxa" w:w="60"/>
+              <w:right w:type="dxa" w:w="100"/>
+            </w:tcMar>
+          </w:tcPr>
+          <w:p>
+            <w:pPr>
+              <w:spacing w:after="40" w:line="260"/>
+            </w:pPr>
+            <w:r>
+              <w:rPr>
+                <w:rFonts w:ascii="Calibri" w:cs="Calibri" w:eastAsia="Calibri" w:hAnsi="Calibri"/>
+                <w:sz w:val="17"/>
+                <w:szCs w:val="17"/>
               </w:rPr>
               <w:t xml:space="preserve">Nielsen heuristic 4; Gestalt similarity.</w:t>
             </w:r>
@@ -8040,31 +8254,61 @@
         </w:tc>
         <w:tc>
           <w:tcPr>
-            <w:tcW w:type="dxa" w:w="2400"/>
-            <w:tcBorders>
-              <w:top w:val="single" w:color="CBD5E1" w:sz="4"/>
-              <w:left w:val="single" w:color="CBD5E1" w:sz="4"/>
-              <w:bottom w:val="single" w:color="CBD5E1" w:sz="4"/>
-              <w:right w:val="single" w:color="CBD5E1" w:sz="4"/>
-            </w:tcBorders>
-            <w:tcMar>
-              <w:top w:type="dxa" w:w="60"/>
-              <w:left w:type="dxa" w:w="100"/>
-              <w:bottom w:type="dxa" w:w="60"/>
-              <w:right w:type="dxa" w:w="100"/>
-            </w:tcMar>
-          </w:tcPr>
-          <w:p>
-            <w:pPr>
-              <w:spacing w:after="40" w:line="260"/>
-            </w:pPr>
-            <w:r>
-              <w:rPr>
-                <w:rFonts w:ascii="Calibri" w:cs="Calibri" w:eastAsia="Calibri" w:hAnsi="Calibri"/>
-                <w:sz w:val="18"/>
-                <w:szCs w:val="18"/>
+            <w:tcW w:type="dxa" w:w="1800"/>
+            <w:tcBorders>
+              <w:top w:val="single" w:color="CBD5E1" w:sz="4"/>
+              <w:left w:val="single" w:color="CBD5E1" w:sz="4"/>
+              <w:bottom w:val="single" w:color="CBD5E1" w:sz="4"/>
+              <w:right w:val="single" w:color="CBD5E1" w:sz="4"/>
+            </w:tcBorders>
+            <w:tcMar>
+              <w:top w:type="dxa" w:w="60"/>
+              <w:left w:type="dxa" w:w="100"/>
+              <w:bottom w:type="dxa" w:w="60"/>
+              <w:right w:type="dxa" w:w="100"/>
+            </w:tcMar>
+          </w:tcPr>
+          <w:p>
+            <w:pPr>
+              <w:spacing w:after="40" w:line="260"/>
+            </w:pPr>
+            <w:r>
+              <w:rPr>
+                <w:rFonts w:ascii="Calibri" w:cs="Calibri" w:eastAsia="Calibri" w:hAnsi="Calibri"/>
+                <w:sz w:val="17"/>
+                <w:szCs w:val="17"/>
               </w:rPr>
               <w:t xml:space="preserve">Should the details page follow the summary card style?</w:t>
+            </w:r>
+          </w:p>
+        </w:tc>
+        <w:tc>
+          <w:tcPr>
+            <w:tcW w:type="dxa" w:w="2300"/>
+            <w:tcBorders>
+              <w:top w:val="single" w:color="CBD5E1" w:sz="4"/>
+              <w:left w:val="single" w:color="CBD5E1" w:sz="4"/>
+              <w:bottom w:val="single" w:color="CBD5E1" w:sz="4"/>
+              <w:right w:val="single" w:color="CBD5E1" w:sz="4"/>
+            </w:tcBorders>
+            <w:tcMar>
+              <w:top w:type="dxa" w:w="60"/>
+              <w:left w:type="dxa" w:w="100"/>
+              <w:bottom w:type="dxa" w:w="60"/>
+              <w:right w:type="dxa" w:w="100"/>
+            </w:tcMar>
+          </w:tcPr>
+          <w:p>
+            <w:pPr>
+              <w:spacing w:after="40" w:line="260"/>
+            </w:pPr>
+            <w:r>
+              <w:rPr>
+                <w:rFonts w:ascii="Calibri" w:cs="Calibri" w:eastAsia="Calibri" w:hAnsi="Calibri"/>
+                <w:sz w:val="17"/>
+                <w:szCs w:val="17"/>
+              </w:rPr>
+              <w:t xml:space="preserve">Yes, the GTM details page follows the cards. Applied.</w:t>
             </w:r>
           </w:p>
         </w:tc>
@@ -8075,29 +8319,29 @@
         </w:trPr>
         <w:tc>
           <w:tcPr>
-            <w:tcW w:type="dxa" w:w="700"/>
-            <w:tcBorders>
-              <w:top w:val="single" w:color="CBD5E1" w:sz="4"/>
-              <w:left w:val="single" w:color="CBD5E1" w:sz="4"/>
-              <w:bottom w:val="single" w:color="CBD5E1" w:sz="4"/>
-              <w:right w:val="single" w:color="CBD5E1" w:sz="4"/>
-            </w:tcBorders>
-            <w:tcMar>
-              <w:top w:type="dxa" w:w="60"/>
-              <w:left w:type="dxa" w:w="100"/>
-              <w:bottom w:type="dxa" w:w="60"/>
-              <w:right w:type="dxa" w:w="100"/>
-            </w:tcMar>
-          </w:tcPr>
-          <w:p>
-            <w:pPr>
-              <w:spacing w:after="40" w:line="260"/>
-            </w:pPr>
-            <w:r>
-              <w:rPr>
-                <w:rFonts w:ascii="Calibri" w:cs="Calibri" w:eastAsia="Calibri" w:hAnsi="Calibri"/>
-                <w:sz w:val="18"/>
-                <w:szCs w:val="18"/>
+            <w:tcW w:type="dxa" w:w="600"/>
+            <w:tcBorders>
+              <w:top w:val="single" w:color="CBD5E1" w:sz="4"/>
+              <w:left w:val="single" w:color="CBD5E1" w:sz="4"/>
+              <w:bottom w:val="single" w:color="CBD5E1" w:sz="4"/>
+              <w:right w:val="single" w:color="CBD5E1" w:sz="4"/>
+            </w:tcBorders>
+            <w:tcMar>
+              <w:top w:type="dxa" w:w="60"/>
+              <w:left w:type="dxa" w:w="100"/>
+              <w:bottom w:type="dxa" w:w="60"/>
+              <w:right w:type="dxa" w:w="100"/>
+            </w:tcMar>
+          </w:tcPr>
+          <w:p>
+            <w:pPr>
+              <w:spacing w:after="40" w:line="260"/>
+            </w:pPr>
+            <w:r>
+              <w:rPr>
+                <w:rFonts w:ascii="Calibri" w:cs="Calibri" w:eastAsia="Calibri" w:hAnsi="Calibri"/>
+                <w:sz w:val="17"/>
+                <w:szCs w:val="17"/>
               </w:rPr>
               <w:t xml:space="preserve">I-08</w:t>
             </w:r>
@@ -8105,29 +8349,29 @@
         </w:tc>
         <w:tc>
           <w:tcPr>
-            <w:tcW w:type="dxa" w:w="1200"/>
-            <w:tcBorders>
-              <w:top w:val="single" w:color="CBD5E1" w:sz="4"/>
-              <w:left w:val="single" w:color="CBD5E1" w:sz="4"/>
-              <w:bottom w:val="single" w:color="CBD5E1" w:sz="4"/>
-              <w:right w:val="single" w:color="CBD5E1" w:sz="4"/>
-            </w:tcBorders>
-            <w:tcMar>
-              <w:top w:type="dxa" w:w="60"/>
-              <w:left w:type="dxa" w:w="100"/>
-              <w:bottom w:type="dxa" w:w="60"/>
-              <w:right w:type="dxa" w:w="100"/>
-            </w:tcMar>
-          </w:tcPr>
-          <w:p>
-            <w:pPr>
-              <w:spacing w:after="40" w:line="260"/>
-            </w:pPr>
-            <w:r>
-              <w:rPr>
-                <w:rFonts w:ascii="Calibri" w:cs="Calibri" w:eastAsia="Calibri" w:hAnsi="Calibri"/>
-                <w:sz w:val="18"/>
-                <w:szCs w:val="18"/>
+            <w:tcW w:type="dxa" w:w="900"/>
+            <w:tcBorders>
+              <w:top w:val="single" w:color="CBD5E1" w:sz="4"/>
+              <w:left w:val="single" w:color="CBD5E1" w:sz="4"/>
+              <w:bottom w:val="single" w:color="CBD5E1" w:sz="4"/>
+              <w:right w:val="single" w:color="CBD5E1" w:sz="4"/>
+            </w:tcBorders>
+            <w:tcMar>
+              <w:top w:type="dxa" w:w="60"/>
+              <w:left w:type="dxa" w:w="100"/>
+              <w:bottom w:type="dxa" w:w="60"/>
+              <w:right w:type="dxa" w:w="100"/>
+            </w:tcMar>
+          </w:tcPr>
+          <w:p>
+            <w:pPr>
+              <w:spacing w:after="40" w:line="260"/>
+            </w:pPr>
+            <w:r>
+              <w:rPr>
+                <w:rFonts w:ascii="Calibri" w:cs="Calibri" w:eastAsia="Calibri" w:hAnsi="Calibri"/>
+                <w:sz w:val="17"/>
+                <w:szCs w:val="17"/>
               </w:rPr>
               <w:t xml:space="preserve">Card header pattern</w:t>
             </w:r>
@@ -8135,29 +8379,29 @@
         </w:tc>
         <w:tc>
           <w:tcPr>
-            <w:tcW w:type="dxa" w:w="3300"/>
-            <w:tcBorders>
-              <w:top w:val="single" w:color="CBD5E1" w:sz="4"/>
-              <w:left w:val="single" w:color="CBD5E1" w:sz="4"/>
-              <w:bottom w:val="single" w:color="CBD5E1" w:sz="4"/>
-              <w:right w:val="single" w:color="CBD5E1" w:sz="4"/>
-            </w:tcBorders>
-            <w:tcMar>
-              <w:top w:type="dxa" w:w="60"/>
-              <w:left w:type="dxa" w:w="100"/>
-              <w:bottom w:type="dxa" w:w="60"/>
-              <w:right w:type="dxa" w:w="100"/>
-            </w:tcMar>
-          </w:tcPr>
-          <w:p>
-            <w:pPr>
-              <w:spacing w:after="40" w:line="260"/>
-            </w:pPr>
-            <w:r>
-              <w:rPr>
-                <w:rFonts w:ascii="Calibri" w:cs="Calibri" w:eastAsia="Calibri" w:hAnsi="Calibri"/>
-                <w:sz w:val="18"/>
-                <w:szCs w:val="18"/>
+            <w:tcW w:type="dxa" w:w="2500"/>
+            <w:tcBorders>
+              <w:top w:val="single" w:color="CBD5E1" w:sz="4"/>
+              <w:left w:val="single" w:color="CBD5E1" w:sz="4"/>
+              <w:bottom w:val="single" w:color="CBD5E1" w:sz="4"/>
+              <w:right w:val="single" w:color="CBD5E1" w:sz="4"/>
+            </w:tcBorders>
+            <w:tcMar>
+              <w:top w:type="dxa" w:w="60"/>
+              <w:left w:type="dxa" w:w="100"/>
+              <w:bottom w:type="dxa" w:w="60"/>
+              <w:right w:type="dxa" w:w="100"/>
+            </w:tcMar>
+          </w:tcPr>
+          <w:p>
+            <w:pPr>
+              <w:spacing w:after="40" w:line="260"/>
+            </w:pPr>
+            <w:r>
+              <w:rPr>
+                <w:rFonts w:ascii="Calibri" w:cs="Calibri" w:eastAsia="Calibri" w:hAnsi="Calibri"/>
+                <w:sz w:val="17"/>
+                <w:szCs w:val="17"/>
               </w:rPr>
               <w:t xml:space="preserve">Team cards put the role pill at the top right, Templates put an amber "need review" tag, GTM puts "Selected", Brands put nothing.</w:t>
             </w:r>
@@ -8165,29 +8409,29 @@
         </w:tc>
         <w:tc>
           <w:tcPr>
-            <w:tcW w:type="dxa" w:w="2000"/>
-            <w:tcBorders>
-              <w:top w:val="single" w:color="CBD5E1" w:sz="4"/>
-              <w:left w:val="single" w:color="CBD5E1" w:sz="4"/>
-              <w:bottom w:val="single" w:color="CBD5E1" w:sz="4"/>
-              <w:right w:val="single" w:color="CBD5E1" w:sz="4"/>
-            </w:tcBorders>
-            <w:tcMar>
-              <w:top w:type="dxa" w:w="60"/>
-              <w:left w:type="dxa" w:w="100"/>
-              <w:bottom w:type="dxa" w:w="60"/>
-              <w:right w:type="dxa" w:w="100"/>
-            </w:tcMar>
-          </w:tcPr>
-          <w:p>
-            <w:pPr>
-              <w:spacing w:after="40" w:line="260"/>
-            </w:pPr>
-            <w:r>
-              <w:rPr>
-                <w:rFonts w:ascii="Calibri" w:cs="Calibri" w:eastAsia="Calibri" w:hAnsi="Calibri"/>
-                <w:sz w:val="18"/>
-                <w:szCs w:val="18"/>
+            <w:tcW w:type="dxa" w:w="1500"/>
+            <w:tcBorders>
+              <w:top w:val="single" w:color="CBD5E1" w:sz="4"/>
+              <w:left w:val="single" w:color="CBD5E1" w:sz="4"/>
+              <w:bottom w:val="single" w:color="CBD5E1" w:sz="4"/>
+              <w:right w:val="single" w:color="CBD5E1" w:sz="4"/>
+            </w:tcBorders>
+            <w:tcMar>
+              <w:top w:type="dxa" w:w="60"/>
+              <w:left w:type="dxa" w:w="100"/>
+              <w:bottom w:type="dxa" w:w="60"/>
+              <w:right w:type="dxa" w:w="100"/>
+            </w:tcMar>
+          </w:tcPr>
+          <w:p>
+            <w:pPr>
+              <w:spacing w:after="40" w:line="260"/>
+            </w:pPr>
+            <w:r>
+              <w:rPr>
+                <w:rFonts w:ascii="Calibri" w:cs="Calibri" w:eastAsia="Calibri" w:hAnsi="Calibri"/>
+                <w:sz w:val="17"/>
+                <w:szCs w:val="17"/>
               </w:rPr>
               <w:t xml:space="preserve">Gestalt similarity; Nielsen heuristic 4.</w:t>
             </w:r>
@@ -8195,31 +8439,61 @@
         </w:tc>
         <w:tc>
           <w:tcPr>
-            <w:tcW w:type="dxa" w:w="2400"/>
-            <w:tcBorders>
-              <w:top w:val="single" w:color="CBD5E1" w:sz="4"/>
-              <w:left w:val="single" w:color="CBD5E1" w:sz="4"/>
-              <w:bottom w:val="single" w:color="CBD5E1" w:sz="4"/>
-              <w:right w:val="single" w:color="CBD5E1" w:sz="4"/>
-            </w:tcBorders>
-            <w:tcMar>
-              <w:top w:type="dxa" w:w="60"/>
-              <w:left w:type="dxa" w:w="100"/>
-              <w:bottom w:type="dxa" w:w="60"/>
-              <w:right w:type="dxa" w:w="100"/>
-            </w:tcMar>
-          </w:tcPr>
-          <w:p>
-            <w:pPr>
-              <w:spacing w:after="40" w:line="260"/>
-            </w:pPr>
-            <w:r>
-              <w:rPr>
-                <w:rFonts w:ascii="Calibri" w:cs="Calibri" w:eastAsia="Calibri" w:hAnsi="Calibri"/>
-                <w:sz w:val="18"/>
-                <w:szCs w:val="18"/>
+            <w:tcW w:type="dxa" w:w="1800"/>
+            <w:tcBorders>
+              <w:top w:val="single" w:color="CBD5E1" w:sz="4"/>
+              <w:left w:val="single" w:color="CBD5E1" w:sz="4"/>
+              <w:bottom w:val="single" w:color="CBD5E1" w:sz="4"/>
+              <w:right w:val="single" w:color="CBD5E1" w:sz="4"/>
+            </w:tcBorders>
+            <w:tcMar>
+              <w:top w:type="dxa" w:w="60"/>
+              <w:left w:type="dxa" w:w="100"/>
+              <w:bottom w:type="dxa" w:w="60"/>
+              <w:right w:type="dxa" w:w="100"/>
+            </w:tcMar>
+          </w:tcPr>
+          <w:p>
+            <w:pPr>
+              <w:spacing w:after="40" w:line="260"/>
+            </w:pPr>
+            <w:r>
+              <w:rPr>
+                <w:rFonts w:ascii="Calibri" w:cs="Calibri" w:eastAsia="Calibri" w:hAnsi="Calibri"/>
+                <w:sz w:val="17"/>
+                <w:szCs w:val="17"/>
               </w:rPr>
               <w:t xml:space="preserve">Is a top-right tag meant to be the same slot on every card, and what does it carry?</w:t>
+            </w:r>
+          </w:p>
+        </w:tc>
+        <w:tc>
+          <w:tcPr>
+            <w:tcW w:type="dxa" w:w="2300"/>
+            <w:tcBorders>
+              <w:top w:val="single" w:color="CBD5E1" w:sz="4"/>
+              <w:left w:val="single" w:color="CBD5E1" w:sz="4"/>
+              <w:bottom w:val="single" w:color="CBD5E1" w:sz="4"/>
+              <w:right w:val="single" w:color="CBD5E1" w:sz="4"/>
+            </w:tcBorders>
+            <w:tcMar>
+              <w:top w:type="dxa" w:w="60"/>
+              <w:left w:type="dxa" w:w="100"/>
+              <w:bottom w:type="dxa" w:w="60"/>
+              <w:right w:type="dxa" w:w="100"/>
+            </w:tcMar>
+          </w:tcPr>
+          <w:p>
+            <w:pPr>
+              <w:spacing w:after="40" w:line="260"/>
+            </w:pPr>
+            <w:r>
+              <w:rPr>
+                <w:rFonts w:ascii="Calibri" w:cs="Calibri" w:eastAsia="Calibri" w:hAnsi="Calibri"/>
+                <w:sz w:val="17"/>
+                <w:szCs w:val="17"/>
+              </w:rPr>
+              <w:t xml:space="preserve">Open. Designer will answer after seeing show/I-08_card_tags.png.</w:t>
             </w:r>
           </w:p>
         </w:tc>
@@ -13104,7 +13378,7 @@
                 <w:sz w:val="18"/>
                 <w:szCs w:val="18"/>
               </w:rPr>
-              <w:t xml:space="preserve"/>
+              <w:t xml:space="preserve">Yes, intended.</w:t>
             </w:r>
           </w:p>
         </w:tc>
@@ -13134,7 +13408,7 @@
                 <w:sz w:val="18"/>
                 <w:szCs w:val="18"/>
               </w:rPr>
-              <w:t xml:space="preserve"/>
+              <w:t xml:space="preserve">14 Oct 2026</w:t>
             </w:r>
           </w:p>
         </w:tc>
@@ -13164,7 +13438,7 @@
                 <w:sz w:val="18"/>
                 <w:szCs w:val="18"/>
               </w:rPr>
-              <w:t xml:space="preserve"/>
+              <w:t xml:space="preserve">Yes, intended. The bar stays hidden.</w:t>
             </w:r>
           </w:p>
         </w:tc>
@@ -13259,7 +13533,7 @@
                 <w:sz w:val="18"/>
                 <w:szCs w:val="18"/>
               </w:rPr>
-              <w:t xml:space="preserve"/>
+              <w:t xml:space="preserve">Left to the reviewer.</w:t>
             </w:r>
           </w:p>
         </w:tc>
@@ -13289,7 +13563,7 @@
                 <w:sz w:val="18"/>
                 <w:szCs w:val="18"/>
               </w:rPr>
-              <w:t xml:space="preserve"/>
+              <w:t xml:space="preserve">14 Oct 2026</w:t>
             </w:r>
           </w:p>
         </w:tc>
@@ -13319,7 +13593,7 @@
                 <w:sz w:val="18"/>
                 <w:szCs w:val="18"/>
               </w:rPr>
-              <w:t xml:space="preserve"/>
+              <w:t xml:space="preserve">Left to the reviewer. Blue filled disc with a white check, no ring stamp, on every success screen. Applied in the fixes file.</w:t>
             </w:r>
           </w:p>
         </w:tc>
@@ -13414,7 +13688,7 @@
                 <w:sz w:val="18"/>
                 <w:szCs w:val="18"/>
               </w:rPr>
-              <w:t xml:space="preserve"/>
+              <w:t xml:space="preserve">Summaries and approvals: action at the bottom of the screen.</w:t>
             </w:r>
           </w:p>
         </w:tc>
@@ -13444,7 +13718,7 @@
                 <w:sz w:val="18"/>
                 <w:szCs w:val="18"/>
               </w:rPr>
-              <w:t xml:space="preserve"/>
+              <w:t xml:space="preserve">14 Oct 2026</w:t>
             </w:r>
           </w:p>
         </w:tc>
@@ -13474,7 +13748,7 @@
                 <w:sz w:val="18"/>
                 <w:szCs w:val="18"/>
               </w:rPr>
-              <w:t xml:space="preserve"/>
+              <w:t xml:space="preserve">Summaries and approvals: action at the bottom of the screen. Approved and end states: action next to the content, as on the business profile approved screen. Applied to success screens.</w:t>
             </w:r>
           </w:p>
         </w:tc>
@@ -13569,7 +13843,7 @@
                 <w:sz w:val="18"/>
                 <w:szCs w:val="18"/>
               </w:rPr>
-              <w:t xml:space="preserve"/>
+              <w:t xml:space="preserve">Open.</w:t>
             </w:r>
           </w:p>
         </w:tc>
@@ -13599,7 +13873,7 @@
                 <w:sz w:val="18"/>
                 <w:szCs w:val="18"/>
               </w:rPr>
-              <w:t xml:space="preserve"/>
+              <w:t xml:space="preserve">14 Oct 2026</w:t>
             </w:r>
           </w:p>
         </w:tc>
@@ -13629,7 +13903,7 @@
                 <w:sz w:val="18"/>
                 <w:szCs w:val="18"/>
               </w:rPr>
-              <w:t xml:space="preserve"/>
+              <w:t xml:space="preserve">Open. Designer will choose after seeing show/I-04_status_forms.png. Interim: on status screens the coloured text goes below the chip (applied).</w:t>
             </w:r>
           </w:p>
         </w:tc>
@@ -13724,7 +13998,7 @@
                 <w:sz w:val="18"/>
                 <w:szCs w:val="18"/>
               </w:rPr>
-              <w:t xml:space="preserve"/>
+              <w:t xml:space="preserve">Yes, Team uses the centred end-state layout.</w:t>
             </w:r>
           </w:p>
         </w:tc>
@@ -13754,7 +14028,7 @@
                 <w:sz w:val="18"/>
                 <w:szCs w:val="18"/>
               </w:rPr>
-              <w:t xml:space="preserve"/>
+              <w:t xml:space="preserve">14 Oct 2026</w:t>
             </w:r>
           </w:p>
         </w:tc>
@@ -13784,7 +14058,7 @@
                 <w:sz w:val="18"/>
                 <w:szCs w:val="18"/>
               </w:rPr>
-              <w:t xml:space="preserve"/>
+              <w:t xml:space="preserve">Yes, Team uses the centred end-state layout. Applied.</w:t>
             </w:r>
           </w:p>
         </w:tc>
@@ -13879,7 +14153,7 @@
                 <w:sz w:val="18"/>
                 <w:szCs w:val="18"/>
               </w:rPr>
-              <w:t xml:space="preserve"/>
+              <w:t xml:space="preserve">The dark screen should not exist.</w:t>
             </w:r>
           </w:p>
         </w:tc>
@@ -13909,7 +14183,7 @@
                 <w:sz w:val="18"/>
                 <w:szCs w:val="18"/>
               </w:rPr>
-              <w:t xml:space="preserve"/>
+              <w:t xml:space="preserve">14 Oct 2026</w:t>
             </w:r>
           </w:p>
         </w:tc>
@@ -13939,7 +14213,7 @@
                 <w:sz w:val="18"/>
                 <w:szCs w:val="18"/>
               </w:rPr>
-              <w:t xml:space="preserve"/>
+              <w:t xml:space="preserve">The dark screen should not exist. Removed: the user lands in the product.</w:t>
             </w:r>
           </w:p>
         </w:tc>
@@ -14034,7 +14308,7 @@
                 <w:sz w:val="18"/>
                 <w:szCs w:val="18"/>
               </w:rPr>
-              <w:t xml:space="preserve"/>
+              <w:t xml:space="preserve">Yes, the GTM details page follows the cards.</w:t>
             </w:r>
           </w:p>
         </w:tc>
@@ -14064,7 +14338,7 @@
                 <w:sz w:val="18"/>
                 <w:szCs w:val="18"/>
               </w:rPr>
-              <w:t xml:space="preserve"/>
+              <w:t xml:space="preserve">14 Oct 2026</w:t>
             </w:r>
           </w:p>
         </w:tc>
@@ -14094,7 +14368,7 @@
                 <w:sz w:val="18"/>
                 <w:szCs w:val="18"/>
               </w:rPr>
-              <w:t xml:space="preserve"/>
+              <w:t xml:space="preserve">Yes, the GTM details page follows the cards. Applied.</w:t>
             </w:r>
           </w:p>
         </w:tc>
@@ -14189,7 +14463,7 @@
                 <w:sz w:val="18"/>
                 <w:szCs w:val="18"/>
               </w:rPr>
-              <w:t xml:space="preserve"/>
+              <w:t xml:space="preserve">Open.</w:t>
             </w:r>
           </w:p>
         </w:tc>
@@ -14219,7 +14493,7 @@
                 <w:sz w:val="18"/>
                 <w:szCs w:val="18"/>
               </w:rPr>
-              <w:t xml:space="preserve"/>
+              <w:t xml:space="preserve">14 Oct 2026</w:t>
             </w:r>
           </w:p>
         </w:tc>
@@ -14249,7 +14523,7 @@
                 <w:sz w:val="18"/>
                 <w:szCs w:val="18"/>
               </w:rPr>
-              <w:t xml:space="preserve"/>
+              <w:t xml:space="preserve">Open. Designer will answer after seeing show/I-08_card_tags.png.</w:t>
             </w:r>
           </w:p>
         </w:tc>

</xml_diff>